<commit_message>
refactor: Compartmentalise functions into folders.
</commit_message>
<xml_diff>
--- a/svd_example/reference_doc.docx
+++ b/svd_example/reference_doc.docx
@@ -1,6 +1,6 @@
 
 <file path=word/document.xml><?xml version="1.0" encoding="utf-8"?>
-<w:document xmlns:wpc="http://schemas.microsoft.com/office/word/2010/wordprocessingCanvas" xmlns:cx="http://schemas.microsoft.com/office/drawing/2014/chartex" xmlns:cx1="http://schemas.microsoft.com/office/drawing/2015/9/8/chartex" xmlns:cx2="http://schemas.microsoft.com/office/drawing/2015/10/21/chartex" xmlns:cx3="http://schemas.microsoft.com/office/drawing/2016/5/9/chartex" xmlns:cx4="http://schemas.microsoft.com/office/drawing/2016/5/10/chartex" xmlns:cx5="http://schemas.microsoft.com/office/drawing/2016/5/11/chartex" xmlns:cx6="http://schemas.microsoft.com/office/drawing/2016/5/12/chartex" xmlns:cx7="http://schemas.microsoft.com/office/drawing/2016/5/13/chartex" xmlns:cx8="http://schemas.microsoft.com/office/drawing/2016/5/14/chartex" xmlns:mc="http://schemas.openxmlformats.org/markup-compatibility/2006" xmlns:aink="http://schemas.microsoft.com/office/drawing/2016/ink" xmlns:am3d="http://schemas.microsoft.com/office/drawing/2017/model3d" xmlns:o="urn:schemas-microsoft-com:office:office" xmlns:oel="http://schemas.microsoft.com/office/2019/extlst" xmlns:r="http://schemas.openxmlformats.org/officeDocument/2006/relationships" xmlns:m="http://schemas.openxmlformats.org/officeDocument/2006/math" xmlns:v="urn:schemas-microsoft-com:vml" xmlns:wp14="http://schemas.microsoft.com/office/word/2010/wordprocessingDrawing" xmlns:wp="http://schemas.openxmlformats.org/drawingml/2006/wordprocessingDrawing" xmlns:w10="urn:schemas-microsoft-com:office:word" xmlns:w="http://schemas.openxmlformats.org/wordprocessingml/2006/main" xmlns:w14="http://schemas.microsoft.com/office/word/2010/wordml" xmlns:w15="http://schemas.microsoft.com/office/word/2012/wordml" xmlns:w16cex="http://schemas.microsoft.com/office/word/2018/wordml/cex" xmlns:w16cid="http://schemas.microsoft.com/office/word/2016/wordml/cid" xmlns:w16="http://schemas.microsoft.com/office/word/2018/wordml" xmlns:w16du="http://schemas.microsoft.com/office/word/2023/wordml/word16du" xmlns:w16sdtdh="http://schemas.microsoft.com/office/word/2020/wordml/sdtdatahash" xmlns:w16sdtfl="http://schemas.microsoft.com/office/word/2024/wordml/sdtformatlock" xmlns:w16se="http://schemas.microsoft.com/office/word/2015/wordml/symex" xmlns:wpg="http://schemas.microsoft.com/office/word/2010/wordprocessingGroup" xmlns:wpi="http://schemas.microsoft.com/office/word/2010/wordprocessingInk" xmlns:wne="http://schemas.microsoft.com/office/word/2006/wordml" xmlns:wps="http://schemas.microsoft.com/office/word/2010/wordprocessingShape" mc:Ignorable="w14 w15 w16se w16cid w16 w16cex w16sdtdh w16sdtfl w16du wp14">
+<w:document xmlns:wpc="http://schemas.microsoft.com/office/word/2010/wordprocessingCanvas" xmlns:cx="http://schemas.microsoft.com/office/drawing/2014/chartex" xmlns:cx1="http://schemas.microsoft.com/office/drawing/2015/9/8/chartex" xmlns:cx2="http://schemas.microsoft.com/office/drawing/2015/10/21/chartex" xmlns:cx3="http://schemas.microsoft.com/office/drawing/2016/5/9/chartex" xmlns:cx4="http://schemas.microsoft.com/office/drawing/2016/5/10/chartex" xmlns:cx5="http://schemas.microsoft.com/office/drawing/2016/5/11/chartex" xmlns:cx6="http://schemas.microsoft.com/office/drawing/2016/5/12/chartex" xmlns:cx7="http://schemas.microsoft.com/office/drawing/2016/5/13/chartex" xmlns:cx8="http://schemas.microsoft.com/office/drawing/2016/5/14/chartex" xmlns:mc="http://schemas.openxmlformats.org/markup-compatibility/2006" xmlns:m="http://schemas.openxmlformats.org/officeDocument/2006/math" xmlns:aink="http://schemas.microsoft.com/office/drawing/2016/ink" xmlns:am3d="http://schemas.microsoft.com/office/drawing/2017/model3d" xmlns:oel="http://schemas.microsoft.com/office/2019/extlst" xmlns:r="http://schemas.openxmlformats.org/officeDocument/2006/relationships" xmlns:wp14="http://schemas.microsoft.com/office/word/2010/wordprocessingDrawing" xmlns:wp="http://schemas.openxmlformats.org/drawingml/2006/wordprocessingDrawing" xmlns:wpg="http://schemas.microsoft.com/office/word/2010/wordprocessingGroup" xmlns:wpi="http://schemas.microsoft.com/office/word/2010/wordprocessingInk" xmlns:wps="http://schemas.microsoft.com/office/word/2010/wordprocessingShape" xmlns:o="urn:schemas-microsoft-com:office:office" xmlns:v="urn:schemas-microsoft-com:vml" xmlns:w10="urn:schemas-microsoft-com:office:word" xmlns:w="http://schemas.openxmlformats.org/wordprocessingml/2006/main" xmlns:w14="http://schemas.microsoft.com/office/word/2010/wordml" xmlns:w15="http://schemas.microsoft.com/office/word/2012/wordml" xmlns:w16cex="http://schemas.microsoft.com/office/word/2018/wordml/cex" xmlns:w16cid="http://schemas.microsoft.com/office/word/2016/wordml/cid" xmlns:w16="http://schemas.microsoft.com/office/word/2018/wordml" xmlns:w16sdtdh="http://schemas.microsoft.com/office/word/2020/wordml/sdtdatahash" xmlns:w16sdtfl="http://schemas.microsoft.com/office/word/2024/wordml/sdtformatlock" xmlns:w16se="http://schemas.microsoft.com/office/word/2015/wordml/symex" xmlns:w16du="http://schemas.microsoft.com/office/word/2023/wordml/word16du" xmlns:wne="http://schemas.microsoft.com/office/word/2006/wordml" mc:Ignorable="w14 w15 w16se w16cid w16 w16cex w16sdtdh w16sdtfl w16du wp14">
   <w:body>
     <w:p/>
     <w:p/>
@@ -92,16 +92,8 @@
         <w:rPr>
           <w:rFonts w:ascii="MS Reference Sans Serif" w:hAnsi="MS Reference Sans Serif" w:cs="Al Bayan Plain"/>
         </w:rPr>
-        <w:t xml:space="preserve">Document Sub </w:t>
+        <w:t>Document Sub Title</w:t>
       </w:r>
-      <w:proofErr w:type="spellStart"/>
-      <w:r>
-        <w:rPr>
-          <w:rFonts w:ascii="MS Reference Sans Serif" w:hAnsi="MS Reference Sans Serif" w:cs="Al Bayan Plain"/>
-        </w:rPr>
-        <w:t>TItle</w:t>
-      </w:r>
-      <w:proofErr w:type="spellEnd"/>
       <w:r>
         <w:rPr>
           <w:rFonts w:ascii="MS Reference Sans Serif" w:hAnsi="MS Reference Sans Serif" w:cs="Al Bayan Plain"/>
@@ -152,9 +144,12 @@
     <w:p>
       <w:pPr>
         <w:sectPr>
-          <w:headerReference w:type="default" r:id="rId6"/>
-          <w:headerReference w:type="first" r:id="rId7"/>
-          <w:footerReference w:type="first" r:id="rId8"/>
+          <w:headerReference w:type="even" r:id="rId7"/>
+          <w:headerReference w:type="default" r:id="rId8"/>
+          <w:footerReference w:type="even" r:id="rId9"/>
+          <w:footerReference w:type="default" r:id="rId10"/>
+          <w:headerReference w:type="first" r:id="rId11"/>
+          <w:footerReference w:type="first" r:id="rId12"/>
           <w:pgSz w:w="11906" w:h="16838"/>
           <w:pgMar w:top="1440" w:right="1440" w:bottom="1440" w:left="1440" w:header="708" w:footer="708" w:gutter="0"/>
           <w:cols w:space="708"/>
@@ -163,7 +158,102 @@
       </w:pPr>
     </w:p>
     <w:p/>
+    <w:sdt>
+      <w:sdtPr>
+        <w:rPr>
+          <w:rFonts w:asciiTheme="minorHAnsi" w:eastAsiaTheme="minorHAnsi" w:hAnsiTheme="minorHAnsi" w:cstheme="minorBidi"/>
+          <w:b w:val="0"/>
+          <w:bCs w:val="0"/>
+          <w:color w:val="auto"/>
+          <w:kern w:val="2"/>
+          <w:sz w:val="24"/>
+          <w:szCs w:val="24"/>
+          <w:lang w:val="en-AU"/>
+          <w14:ligatures w14:val="standardContextual"/>
+        </w:rPr>
+        <w:id w:val="940727828"/>
+        <w:docPartObj>
+          <w:docPartGallery w:val="Table of Contents"/>
+          <w:docPartUnique/>
+        </w:docPartObj>
+      </w:sdtPr>
+      <w:sdtEndPr>
+        <w:rPr>
+          <w:noProof/>
+        </w:rPr>
+      </w:sdtEndPr>
+      <w:sdtContent>
+        <w:p>
+          <w:pPr>
+            <w:pStyle w:val="TOCHeading"/>
+          </w:pPr>
+          <w:r>
+            <w:t>Table of Contents</w:t>
+          </w:r>
+        </w:p>
+        <w:p>
+          <w:fldSimple w:instr=" TOC \o &quot;1-3&quot; \h \z \u ">
+            <w:r>
+              <w:rPr>
+                <w:b/>
+                <w:bCs/>
+                <w:noProof/>
+                <w:lang w:val="en-GB"/>
+              </w:rPr>
+              <w:t>No table of contents entries found.</w:t>
+            </w:r>
+          </w:fldSimple>
+        </w:p>
+      </w:sdtContent>
+    </w:sdt>
+    <w:p/>
+    <w:p>
+      <w:pPr>
+        <w:pStyle w:val="TOCHeading"/>
+      </w:pPr>
+      <w:r>
+        <w:t>Table of Figures</w:t>
+      </w:r>
+    </w:p>
+    <w:p>
+      <w:pPr>
+        <w:rPr>
+          <w:b/>
+          <w:bCs/>
+          <w:noProof/>
+          <w:lang w:val="en-GB"/>
+        </w:rPr>
+      </w:pPr>
+      <w:fldSimple w:instr=" TOC \h \z \t &quot;Image Caption&quot; \c ">
+        <w:r>
+          <w:rPr>
+            <w:b/>
+            <w:bCs/>
+            <w:noProof/>
+            <w:lang w:val="en-GB"/>
+          </w:rPr>
+          <w:t>No table of figures entries found.</w:t>
+        </w:r>
+      </w:fldSimple>
+    </w:p>
+    <w:p>
+      <w:pPr>
+        <w:rPr>
+          <w:b/>
+          <w:bCs/>
+          <w:noProof/>
+          <w:lang w:val="en-GB"/>
+        </w:rPr>
+      </w:pPr>
+    </w:p>
+    <w:p>
+      <w:r>
+        <w:br w:type="page"/>
+      </w:r>
+    </w:p>
+    <w:p/>
     <w:sectPr>
+      <w:headerReference w:type="default" r:id="rId13"/>
       <w:pgSz w:w="11906" w:h="16838"/>
       <w:pgMar w:top="1440" w:right="1440" w:bottom="1440" w:left="1440" w:header="708" w:footer="708" w:gutter="0"/>
       <w:cols w:space="708"/>
@@ -175,7 +265,7 @@
 </file>
 
 <file path=word/endnotes.xml><?xml version="1.0" encoding="utf-8"?>
-<w:endnotes xmlns:wpc="http://schemas.microsoft.com/office/word/2010/wordprocessingCanvas" xmlns:cx="http://schemas.microsoft.com/office/drawing/2014/chartex" xmlns:cx1="http://schemas.microsoft.com/office/drawing/2015/9/8/chartex" xmlns:cx2="http://schemas.microsoft.com/office/drawing/2015/10/21/chartex" xmlns:cx3="http://schemas.microsoft.com/office/drawing/2016/5/9/chartex" xmlns:cx4="http://schemas.microsoft.com/office/drawing/2016/5/10/chartex" xmlns:cx5="http://schemas.microsoft.com/office/drawing/2016/5/11/chartex" xmlns:cx6="http://schemas.microsoft.com/office/drawing/2016/5/12/chartex" xmlns:cx7="http://schemas.microsoft.com/office/drawing/2016/5/13/chartex" xmlns:cx8="http://schemas.microsoft.com/office/drawing/2016/5/14/chartex" xmlns:mc="http://schemas.openxmlformats.org/markup-compatibility/2006" xmlns:aink="http://schemas.microsoft.com/office/drawing/2016/ink" xmlns:am3d="http://schemas.microsoft.com/office/drawing/2017/model3d" xmlns:o="urn:schemas-microsoft-com:office:office" xmlns:oel="http://schemas.microsoft.com/office/2019/extlst" xmlns:r="http://schemas.openxmlformats.org/officeDocument/2006/relationships" xmlns:m="http://schemas.openxmlformats.org/officeDocument/2006/math" xmlns:v="urn:schemas-microsoft-com:vml" xmlns:wp14="http://schemas.microsoft.com/office/word/2010/wordprocessingDrawing" xmlns:wp="http://schemas.openxmlformats.org/drawingml/2006/wordprocessingDrawing" xmlns:w10="urn:schemas-microsoft-com:office:word" xmlns:w="http://schemas.openxmlformats.org/wordprocessingml/2006/main" xmlns:w14="http://schemas.microsoft.com/office/word/2010/wordml" xmlns:w15="http://schemas.microsoft.com/office/word/2012/wordml" xmlns:w16cex="http://schemas.microsoft.com/office/word/2018/wordml/cex" xmlns:w16cid="http://schemas.microsoft.com/office/word/2016/wordml/cid" xmlns:w16="http://schemas.microsoft.com/office/word/2018/wordml" xmlns:w16du="http://schemas.microsoft.com/office/word/2023/wordml/word16du" xmlns:w16sdtdh="http://schemas.microsoft.com/office/word/2020/wordml/sdtdatahash" xmlns:w16sdtfl="http://schemas.microsoft.com/office/word/2024/wordml/sdtformatlock" xmlns:w16se="http://schemas.microsoft.com/office/word/2015/wordml/symex" xmlns:wpg="http://schemas.microsoft.com/office/word/2010/wordprocessingGroup" xmlns:wpi="http://schemas.microsoft.com/office/word/2010/wordprocessingInk" xmlns:wne="http://schemas.microsoft.com/office/word/2006/wordml" xmlns:wps="http://schemas.microsoft.com/office/word/2010/wordprocessingShape" mc:Ignorable="w14 w15 w16se w16cid w16 w16cex w16sdtdh w16sdtfl w16du wp14">
+<w:endnotes xmlns:wpc="http://schemas.microsoft.com/office/word/2010/wordprocessingCanvas" xmlns:cx="http://schemas.microsoft.com/office/drawing/2014/chartex" xmlns:cx1="http://schemas.microsoft.com/office/drawing/2015/9/8/chartex" xmlns:cx2="http://schemas.microsoft.com/office/drawing/2015/10/21/chartex" xmlns:cx3="http://schemas.microsoft.com/office/drawing/2016/5/9/chartex" xmlns:cx4="http://schemas.microsoft.com/office/drawing/2016/5/10/chartex" xmlns:cx5="http://schemas.microsoft.com/office/drawing/2016/5/11/chartex" xmlns:cx6="http://schemas.microsoft.com/office/drawing/2016/5/12/chartex" xmlns:cx7="http://schemas.microsoft.com/office/drawing/2016/5/13/chartex" xmlns:cx8="http://schemas.microsoft.com/office/drawing/2016/5/14/chartex" xmlns:mc="http://schemas.openxmlformats.org/markup-compatibility/2006" xmlns:m="http://schemas.openxmlformats.org/officeDocument/2006/math" xmlns:aink="http://schemas.microsoft.com/office/drawing/2016/ink" xmlns:am3d="http://schemas.microsoft.com/office/drawing/2017/model3d" xmlns:oel="http://schemas.microsoft.com/office/2019/extlst" xmlns:r="http://schemas.openxmlformats.org/officeDocument/2006/relationships" xmlns:wp14="http://schemas.microsoft.com/office/word/2010/wordprocessingDrawing" xmlns:wp="http://schemas.openxmlformats.org/drawingml/2006/wordprocessingDrawing" xmlns:wpg="http://schemas.microsoft.com/office/word/2010/wordprocessingGroup" xmlns:wpi="http://schemas.microsoft.com/office/word/2010/wordprocessingInk" xmlns:wps="http://schemas.microsoft.com/office/word/2010/wordprocessingShape" xmlns:o="urn:schemas-microsoft-com:office:office" xmlns:v="urn:schemas-microsoft-com:vml" xmlns:w10="urn:schemas-microsoft-com:office:word" xmlns:w="http://schemas.openxmlformats.org/wordprocessingml/2006/main" xmlns:w14="http://schemas.microsoft.com/office/word/2010/wordml" xmlns:w15="http://schemas.microsoft.com/office/word/2012/wordml" xmlns:w16cex="http://schemas.microsoft.com/office/word/2018/wordml/cex" xmlns:w16cid="http://schemas.microsoft.com/office/word/2016/wordml/cid" xmlns:w16="http://schemas.microsoft.com/office/word/2018/wordml" xmlns:w16sdtdh="http://schemas.microsoft.com/office/word/2020/wordml/sdtdatahash" xmlns:w16sdtfl="http://schemas.microsoft.com/office/word/2024/wordml/sdtformatlock" xmlns:w16se="http://schemas.microsoft.com/office/word/2015/wordml/symex" xmlns:w16du="http://schemas.microsoft.com/office/word/2023/wordml/word16du" xmlns:wne="http://schemas.microsoft.com/office/word/2006/wordml" mc:Ignorable="w14 w15 w16se w16cid w16 w16cex w16sdtdh w16sdtfl w16du wp14">
   <w:endnote w:type="separator" w:id="-1">
     <w:p>
       <w:pPr>
@@ -200,7 +290,292 @@
 </file>
 
 <file path=word/footer1.xml><?xml version="1.0" encoding="utf-8"?>
-<w:ftr xmlns:wpc="http://schemas.microsoft.com/office/word/2010/wordprocessingCanvas" xmlns:cx="http://schemas.microsoft.com/office/drawing/2014/chartex" xmlns:cx1="http://schemas.microsoft.com/office/drawing/2015/9/8/chartex" xmlns:cx2="http://schemas.microsoft.com/office/drawing/2015/10/21/chartex" xmlns:cx3="http://schemas.microsoft.com/office/drawing/2016/5/9/chartex" xmlns:cx4="http://schemas.microsoft.com/office/drawing/2016/5/10/chartex" xmlns:cx5="http://schemas.microsoft.com/office/drawing/2016/5/11/chartex" xmlns:cx6="http://schemas.microsoft.com/office/drawing/2016/5/12/chartex" xmlns:cx7="http://schemas.microsoft.com/office/drawing/2016/5/13/chartex" xmlns:cx8="http://schemas.microsoft.com/office/drawing/2016/5/14/chartex" xmlns:mc="http://schemas.openxmlformats.org/markup-compatibility/2006" xmlns:aink="http://schemas.microsoft.com/office/drawing/2016/ink" xmlns:am3d="http://schemas.microsoft.com/office/drawing/2017/model3d" xmlns:o="urn:schemas-microsoft-com:office:office" xmlns:oel="http://schemas.microsoft.com/office/2019/extlst" xmlns:r="http://schemas.openxmlformats.org/officeDocument/2006/relationships" xmlns:m="http://schemas.openxmlformats.org/officeDocument/2006/math" xmlns:v="urn:schemas-microsoft-com:vml" xmlns:wp14="http://schemas.microsoft.com/office/word/2010/wordprocessingDrawing" xmlns:wp="http://schemas.openxmlformats.org/drawingml/2006/wordprocessingDrawing" xmlns:w10="urn:schemas-microsoft-com:office:word" xmlns:w="http://schemas.openxmlformats.org/wordprocessingml/2006/main" xmlns:w14="http://schemas.microsoft.com/office/word/2010/wordml" xmlns:w15="http://schemas.microsoft.com/office/word/2012/wordml" xmlns:w16cex="http://schemas.microsoft.com/office/word/2018/wordml/cex" xmlns:w16cid="http://schemas.microsoft.com/office/word/2016/wordml/cid" xmlns:w16="http://schemas.microsoft.com/office/word/2018/wordml" xmlns:w16du="http://schemas.microsoft.com/office/word/2023/wordml/word16du" xmlns:w16sdtdh="http://schemas.microsoft.com/office/word/2020/wordml/sdtdatahash" xmlns:w16sdtfl="http://schemas.microsoft.com/office/word/2024/wordml/sdtformatlock" xmlns:w16se="http://schemas.microsoft.com/office/word/2015/wordml/symex" xmlns:wpg="http://schemas.microsoft.com/office/word/2010/wordprocessingGroup" xmlns:wpi="http://schemas.microsoft.com/office/word/2010/wordprocessingInk" xmlns:wne="http://schemas.microsoft.com/office/word/2006/wordml" xmlns:wps="http://schemas.microsoft.com/office/word/2010/wordprocessingShape" mc:Ignorable="w14 w15 w16se w16cid w16 w16cex w16sdtdh w16sdtfl w16du wp14">
+<w:ftr xmlns:wpc="http://schemas.microsoft.com/office/word/2010/wordprocessingCanvas" xmlns:cx="http://schemas.microsoft.com/office/drawing/2014/chartex" xmlns:cx1="http://schemas.microsoft.com/office/drawing/2015/9/8/chartex" xmlns:cx2="http://schemas.microsoft.com/office/drawing/2015/10/21/chartex" xmlns:cx3="http://schemas.microsoft.com/office/drawing/2016/5/9/chartex" xmlns:cx4="http://schemas.microsoft.com/office/drawing/2016/5/10/chartex" xmlns:cx5="http://schemas.microsoft.com/office/drawing/2016/5/11/chartex" xmlns:cx6="http://schemas.microsoft.com/office/drawing/2016/5/12/chartex" xmlns:cx7="http://schemas.microsoft.com/office/drawing/2016/5/13/chartex" xmlns:cx8="http://schemas.microsoft.com/office/drawing/2016/5/14/chartex" xmlns:mc="http://schemas.openxmlformats.org/markup-compatibility/2006" xmlns:m="http://schemas.openxmlformats.org/officeDocument/2006/math" xmlns:aink="http://schemas.microsoft.com/office/drawing/2016/ink" xmlns:am3d="http://schemas.microsoft.com/office/drawing/2017/model3d" xmlns:oel="http://schemas.microsoft.com/office/2019/extlst" xmlns:r="http://schemas.openxmlformats.org/officeDocument/2006/relationships" xmlns:wp14="http://schemas.microsoft.com/office/word/2010/wordprocessingDrawing" xmlns:wp="http://schemas.openxmlformats.org/drawingml/2006/wordprocessingDrawing" xmlns:wpg="http://schemas.microsoft.com/office/word/2010/wordprocessingGroup" xmlns:wpi="http://schemas.microsoft.com/office/word/2010/wordprocessingInk" xmlns:wps="http://schemas.microsoft.com/office/word/2010/wordprocessingShape" xmlns:o="urn:schemas-microsoft-com:office:office" xmlns:v="urn:schemas-microsoft-com:vml" xmlns:w10="urn:schemas-microsoft-com:office:word" xmlns:w="http://schemas.openxmlformats.org/wordprocessingml/2006/main" xmlns:w14="http://schemas.microsoft.com/office/word/2010/wordml" xmlns:w15="http://schemas.microsoft.com/office/word/2012/wordml" xmlns:w16cex="http://schemas.microsoft.com/office/word/2018/wordml/cex" xmlns:w16cid="http://schemas.microsoft.com/office/word/2016/wordml/cid" xmlns:w16="http://schemas.microsoft.com/office/word/2018/wordml" xmlns:w16sdtdh="http://schemas.microsoft.com/office/word/2020/wordml/sdtdatahash" xmlns:w16sdtfl="http://schemas.microsoft.com/office/word/2024/wordml/sdtformatlock" xmlns:w16se="http://schemas.microsoft.com/office/word/2015/wordml/symex" xmlns:w16du="http://schemas.microsoft.com/office/word/2023/wordml/word16du" xmlns:wne="http://schemas.microsoft.com/office/word/2006/wordml" mc:Ignorable="w14 w15 w16se w16cid w16 w16cex w16sdtdh w16sdtfl w16du wp14">
+  <w:p>
+    <w:pPr>
+      <w:pStyle w:val="Footer"/>
+    </w:pPr>
+  </w:p>
+</w:ftr>
+</file>
+
+<file path=word/footer2.xml><?xml version="1.0" encoding="utf-8"?>
+<w:ftr xmlns:wpc="http://schemas.microsoft.com/office/word/2010/wordprocessingCanvas" xmlns:cx="http://schemas.microsoft.com/office/drawing/2014/chartex" xmlns:cx1="http://schemas.microsoft.com/office/drawing/2015/9/8/chartex" xmlns:cx2="http://schemas.microsoft.com/office/drawing/2015/10/21/chartex" xmlns:cx3="http://schemas.microsoft.com/office/drawing/2016/5/9/chartex" xmlns:cx4="http://schemas.microsoft.com/office/drawing/2016/5/10/chartex" xmlns:cx5="http://schemas.microsoft.com/office/drawing/2016/5/11/chartex" xmlns:cx6="http://schemas.microsoft.com/office/drawing/2016/5/12/chartex" xmlns:cx7="http://schemas.microsoft.com/office/drawing/2016/5/13/chartex" xmlns:cx8="http://schemas.microsoft.com/office/drawing/2016/5/14/chartex" xmlns:mc="http://schemas.openxmlformats.org/markup-compatibility/2006" xmlns:m="http://schemas.openxmlformats.org/officeDocument/2006/math" xmlns:aink="http://schemas.microsoft.com/office/drawing/2016/ink" xmlns:am3d="http://schemas.microsoft.com/office/drawing/2017/model3d" xmlns:oel="http://schemas.microsoft.com/office/2019/extlst" xmlns:r="http://schemas.openxmlformats.org/officeDocument/2006/relationships" xmlns:wp14="http://schemas.microsoft.com/office/word/2010/wordprocessingDrawing" xmlns:wp="http://schemas.openxmlformats.org/drawingml/2006/wordprocessingDrawing" xmlns:wpg="http://schemas.microsoft.com/office/word/2010/wordprocessingGroup" xmlns:wpi="http://schemas.microsoft.com/office/word/2010/wordprocessingInk" xmlns:wps="http://schemas.microsoft.com/office/word/2010/wordprocessingShape" xmlns:o="urn:schemas-microsoft-com:office:office" xmlns:v="urn:schemas-microsoft-com:vml" xmlns:w10="urn:schemas-microsoft-com:office:word" xmlns:w="http://schemas.openxmlformats.org/wordprocessingml/2006/main" xmlns:w14="http://schemas.microsoft.com/office/word/2010/wordml" xmlns:w15="http://schemas.microsoft.com/office/word/2012/wordml" xmlns:w16cex="http://schemas.microsoft.com/office/word/2018/wordml/cex" xmlns:w16cid="http://schemas.microsoft.com/office/word/2016/wordml/cid" xmlns:w16="http://schemas.microsoft.com/office/word/2018/wordml" xmlns:w16sdtdh="http://schemas.microsoft.com/office/word/2020/wordml/sdtdatahash" xmlns:w16sdtfl="http://schemas.microsoft.com/office/word/2024/wordml/sdtformatlock" xmlns:w16se="http://schemas.microsoft.com/office/word/2015/wordml/symex" xmlns:w16du="http://schemas.microsoft.com/office/word/2023/wordml/word16du" xmlns:wne="http://schemas.microsoft.com/office/word/2006/wordml" mc:Ignorable="w14 w15 w16se w16cid w16 w16cex w16sdtdh w16sdtfl w16du wp14">
+  <w:sdt>
+    <w:sdtPr>
+      <w:rPr>
+        <w:rStyle w:val="PageNumber"/>
+        <w:sz w:val="20"/>
+        <w:szCs w:val="20"/>
+      </w:rPr>
+      <w:id w:val="1657418890"/>
+      <w:docPartObj>
+        <w:docPartGallery w:val="Page Numbers (Bottom of Page)"/>
+        <w:docPartUnique/>
+      </w:docPartObj>
+    </w:sdtPr>
+    <w:sdtContent>
+      <w:p>
+        <w:pPr>
+          <w:pStyle w:val="Footer"/>
+          <w:framePr w:wrap="none" w:vAnchor="text" w:hAnchor="margin" w:xAlign="right" w:y="1"/>
+          <w:rPr>
+            <w:rStyle w:val="PageNumber"/>
+            <w:sz w:val="20"/>
+            <w:szCs w:val="20"/>
+          </w:rPr>
+        </w:pPr>
+        <w:r>
+          <w:rPr>
+            <w:rStyle w:val="PageNumber"/>
+            <w:sz w:val="20"/>
+            <w:szCs w:val="20"/>
+          </w:rPr>
+          <w:t xml:space="preserve">Page </w:t>
+        </w:r>
+        <w:r>
+          <w:rPr>
+            <w:rStyle w:val="PageNumber"/>
+            <w:sz w:val="20"/>
+            <w:szCs w:val="20"/>
+          </w:rPr>
+          <w:fldChar w:fldCharType="begin"/>
+        </w:r>
+        <w:r>
+          <w:rPr>
+            <w:rStyle w:val="PageNumber"/>
+            <w:sz w:val="20"/>
+            <w:szCs w:val="20"/>
+          </w:rPr>
+          <w:instrText xml:space="preserve"> PAGE </w:instrText>
+        </w:r>
+        <w:r>
+          <w:rPr>
+            <w:rStyle w:val="PageNumber"/>
+            <w:sz w:val="20"/>
+            <w:szCs w:val="20"/>
+          </w:rPr>
+          <w:fldChar w:fldCharType="separate"/>
+        </w:r>
+        <w:r>
+          <w:rPr>
+            <w:rStyle w:val="PageNumber"/>
+            <w:sz w:val="20"/>
+            <w:szCs w:val="20"/>
+          </w:rPr>
+          <w:t>2</w:t>
+        </w:r>
+        <w:r>
+          <w:rPr>
+            <w:rStyle w:val="PageNumber"/>
+            <w:sz w:val="20"/>
+            <w:szCs w:val="20"/>
+          </w:rPr>
+          <w:fldChar w:fldCharType="end"/>
+        </w:r>
+        <w:r>
+          <w:rPr>
+            <w:rStyle w:val="PageNumber"/>
+            <w:sz w:val="20"/>
+            <w:szCs w:val="20"/>
+          </w:rPr>
+          <w:t xml:space="preserve"> of </w:t>
+        </w:r>
+        <w:r>
+          <w:rPr>
+            <w:rStyle w:val="PageNumber"/>
+            <w:sz w:val="20"/>
+            <w:szCs w:val="20"/>
+          </w:rPr>
+          <w:fldChar w:fldCharType="begin"/>
+        </w:r>
+        <w:r>
+          <w:rPr>
+            <w:rStyle w:val="PageNumber"/>
+            <w:sz w:val="20"/>
+            <w:szCs w:val="20"/>
+          </w:rPr>
+          <w:instrText xml:space="preserve"> NUMPAGES  \* MERGEFORMAT </w:instrText>
+        </w:r>
+        <w:r>
+          <w:rPr>
+            <w:rStyle w:val="PageNumber"/>
+            <w:sz w:val="20"/>
+            <w:szCs w:val="20"/>
+          </w:rPr>
+          <w:fldChar w:fldCharType="separate"/>
+        </w:r>
+        <w:r>
+          <w:rPr>
+            <w:rStyle w:val="PageNumber"/>
+            <w:sz w:val="20"/>
+            <w:szCs w:val="20"/>
+          </w:rPr>
+          <w:t>3</w:t>
+        </w:r>
+        <w:r>
+          <w:rPr>
+            <w:rStyle w:val="PageNumber"/>
+            <w:sz w:val="20"/>
+            <w:szCs w:val="20"/>
+          </w:rPr>
+          <w:fldChar w:fldCharType="end"/>
+        </w:r>
+      </w:p>
+    </w:sdtContent>
+  </w:sdt>
+  <w:p>
+    <w:pPr>
+      <w:pStyle w:val="Footer"/>
+      <w:ind w:right="360"/>
+      <w:rPr>
+        <w:sz w:val="20"/>
+        <w:szCs w:val="20"/>
+      </w:rPr>
+    </w:pPr>
+    <w:r>
+      <w:rPr>
+        <w:sz w:val="20"/>
+        <w:szCs w:val="20"/>
+      </w:rPr>
+      <w:fldChar w:fldCharType="begin"/>
+    </w:r>
+    <w:r>
+      <w:rPr>
+        <w:sz w:val="20"/>
+        <w:szCs w:val="20"/>
+      </w:rPr>
+      <w:instrText xml:space="preserve"> DOCPROPERTY doc_title \* MERGEFORMAT </w:instrText>
+    </w:r>
+    <w:r>
+      <w:rPr>
+        <w:sz w:val="20"/>
+        <w:szCs w:val="20"/>
+      </w:rPr>
+      <w:fldChar w:fldCharType="separate"/>
+    </w:r>
+    <w:r>
+      <w:rPr>
+        <w:sz w:val="20"/>
+        <w:szCs w:val="20"/>
+      </w:rPr>
+      <w:t>Document Title</w:t>
+    </w:r>
+    <w:r>
+      <w:rPr>
+        <w:sz w:val="20"/>
+        <w:szCs w:val="20"/>
+      </w:rPr>
+      <w:fldChar w:fldCharType="end"/>
+    </w:r>
+    <w:r>
+      <w:rPr>
+        <w:sz w:val="20"/>
+        <w:szCs w:val="20"/>
+      </w:rPr>
+      <w:tab/>
+      <w:t xml:space="preserve"> </w:t>
+    </w:r>
+    <w:r>
+      <w:rPr>
+        <w:b/>
+        <w:bCs/>
+        <w:color w:val="EE0000"/>
+        <w:sz w:val="20"/>
+        <w:szCs w:val="20"/>
+      </w:rPr>
+      <w:fldChar w:fldCharType="begin"/>
+    </w:r>
+    <w:r>
+      <w:rPr>
+        <w:b/>
+        <w:bCs/>
+        <w:color w:val="EE0000"/>
+        <w:sz w:val="20"/>
+        <w:szCs w:val="20"/>
+      </w:rPr>
+      <w:instrText xml:space="preserve"> DOCPROPERTY classification \* MERGEFORMAT </w:instrText>
+    </w:r>
+    <w:r>
+      <w:rPr>
+        <w:b/>
+        <w:bCs/>
+        <w:color w:val="EE0000"/>
+        <w:sz w:val="20"/>
+        <w:szCs w:val="20"/>
+      </w:rPr>
+      <w:fldChar w:fldCharType="separate"/>
+    </w:r>
+    <w:r>
+      <w:rPr>
+        <w:b/>
+        <w:bCs/>
+        <w:color w:val="EE0000"/>
+        <w:sz w:val="20"/>
+        <w:szCs w:val="20"/>
+      </w:rPr>
+      <w:t>CLASSIFICATION</w:t>
+    </w:r>
+    <w:r>
+      <w:rPr>
+        <w:b/>
+        <w:bCs/>
+        <w:color w:val="EE0000"/>
+        <w:sz w:val="20"/>
+        <w:szCs w:val="20"/>
+      </w:rPr>
+      <w:fldChar w:fldCharType="end"/>
+    </w:r>
+  </w:p>
+  <w:p>
+    <w:pPr>
+      <w:pStyle w:val="Footer"/>
+      <w:rPr>
+        <w:sz w:val="20"/>
+        <w:szCs w:val="20"/>
+      </w:rPr>
+    </w:pPr>
+    <w:r>
+      <w:rPr>
+        <w:sz w:val="20"/>
+        <w:szCs w:val="20"/>
+      </w:rPr>
+      <w:fldChar w:fldCharType="begin"/>
+    </w:r>
+    <w:r>
+      <w:rPr>
+        <w:sz w:val="20"/>
+        <w:szCs w:val="20"/>
+      </w:rPr>
+      <w:instrText xml:space="preserve"> DOCPROPERTY doc_sub_title \* MERGEFORMAT </w:instrText>
+    </w:r>
+    <w:r>
+      <w:rPr>
+        <w:sz w:val="20"/>
+        <w:szCs w:val="20"/>
+      </w:rPr>
+      <w:fldChar w:fldCharType="separate"/>
+    </w:r>
+    <w:r>
+      <w:rPr>
+        <w:sz w:val="20"/>
+        <w:szCs w:val="20"/>
+      </w:rPr>
+      <w:t>Document Sub Title</w:t>
+    </w:r>
+    <w:r>
+      <w:rPr>
+        <w:sz w:val="20"/>
+        <w:szCs w:val="20"/>
+      </w:rPr>
+      <w:fldChar w:fldCharType="end"/>
+    </w:r>
+  </w:p>
+</w:ftr>
+</file>
+
+<file path=word/footer3.xml><?xml version="1.0" encoding="utf-8"?>
+<w:ftr xmlns:wpc="http://schemas.microsoft.com/office/word/2010/wordprocessingCanvas" xmlns:cx="http://schemas.microsoft.com/office/drawing/2014/chartex" xmlns:cx1="http://schemas.microsoft.com/office/drawing/2015/9/8/chartex" xmlns:cx2="http://schemas.microsoft.com/office/drawing/2015/10/21/chartex" xmlns:cx3="http://schemas.microsoft.com/office/drawing/2016/5/9/chartex" xmlns:cx4="http://schemas.microsoft.com/office/drawing/2016/5/10/chartex" xmlns:cx5="http://schemas.microsoft.com/office/drawing/2016/5/11/chartex" xmlns:cx6="http://schemas.microsoft.com/office/drawing/2016/5/12/chartex" xmlns:cx7="http://schemas.microsoft.com/office/drawing/2016/5/13/chartex" xmlns:cx8="http://schemas.microsoft.com/office/drawing/2016/5/14/chartex" xmlns:mc="http://schemas.openxmlformats.org/markup-compatibility/2006" xmlns:m="http://schemas.openxmlformats.org/officeDocument/2006/math" xmlns:aink="http://schemas.microsoft.com/office/drawing/2016/ink" xmlns:am3d="http://schemas.microsoft.com/office/drawing/2017/model3d" xmlns:oel="http://schemas.microsoft.com/office/2019/extlst" xmlns:r="http://schemas.openxmlformats.org/officeDocument/2006/relationships" xmlns:wp14="http://schemas.microsoft.com/office/word/2010/wordprocessingDrawing" xmlns:wp="http://schemas.openxmlformats.org/drawingml/2006/wordprocessingDrawing" xmlns:wpg="http://schemas.microsoft.com/office/word/2010/wordprocessingGroup" xmlns:wpi="http://schemas.microsoft.com/office/word/2010/wordprocessingInk" xmlns:wps="http://schemas.microsoft.com/office/word/2010/wordprocessingShape" xmlns:o="urn:schemas-microsoft-com:office:office" xmlns:v="urn:schemas-microsoft-com:vml" xmlns:w10="urn:schemas-microsoft-com:office:word" xmlns:w="http://schemas.openxmlformats.org/wordprocessingml/2006/main" xmlns:w14="http://schemas.microsoft.com/office/word/2010/wordml" xmlns:w15="http://schemas.microsoft.com/office/word/2012/wordml" xmlns:w16cex="http://schemas.microsoft.com/office/word/2018/wordml/cex" xmlns:w16cid="http://schemas.microsoft.com/office/word/2016/wordml/cid" xmlns:w16="http://schemas.microsoft.com/office/word/2018/wordml" xmlns:w16sdtdh="http://schemas.microsoft.com/office/word/2020/wordml/sdtdatahash" xmlns:w16sdtfl="http://schemas.microsoft.com/office/word/2024/wordml/sdtformatlock" xmlns:w16se="http://schemas.microsoft.com/office/word/2015/wordml/symex" xmlns:w16du="http://schemas.microsoft.com/office/word/2023/wordml/word16du" xmlns:wne="http://schemas.microsoft.com/office/word/2006/wordml" mc:Ignorable="w14 w15 w16se w16cid w16 w16cex w16sdtdh w16sdtfl w16du wp14">
   <w:sdt>
     <w:sdtPr>
       <w:rPr>
@@ -416,7 +791,7 @@
         <w:sz w:val="20"/>
         <w:szCs w:val="20"/>
       </w:rPr>
-      <w:t>OFFICIAL</w:t>
+      <w:t>CLASSIFICATION</w:t>
     </w:r>
     <w:r>
       <w:rPr>
@@ -463,17 +838,8 @@
         <w:sz w:val="20"/>
         <w:szCs w:val="20"/>
       </w:rPr>
-      <w:t xml:space="preserve">Document Sub </w:t>
-    </w:r>
-    <w:proofErr w:type="spellStart"/>
-    <w:r>
-      <w:rPr>
-        <w:sz w:val="20"/>
-        <w:szCs w:val="20"/>
-      </w:rPr>
-      <w:t>TItle</w:t>
-    </w:r>
-    <w:proofErr w:type="spellEnd"/>
+      <w:t>Document Sub Title</w:t>
+    </w:r>
     <w:r>
       <w:rPr>
         <w:sz w:val="20"/>
@@ -486,7 +852,7 @@
 </file>
 
 <file path=word/footnotes.xml><?xml version="1.0" encoding="utf-8"?>
-<w:footnotes xmlns:wpc="http://schemas.microsoft.com/office/word/2010/wordprocessingCanvas" xmlns:cx="http://schemas.microsoft.com/office/drawing/2014/chartex" xmlns:cx1="http://schemas.microsoft.com/office/drawing/2015/9/8/chartex" xmlns:cx2="http://schemas.microsoft.com/office/drawing/2015/10/21/chartex" xmlns:cx3="http://schemas.microsoft.com/office/drawing/2016/5/9/chartex" xmlns:cx4="http://schemas.microsoft.com/office/drawing/2016/5/10/chartex" xmlns:cx5="http://schemas.microsoft.com/office/drawing/2016/5/11/chartex" xmlns:cx6="http://schemas.microsoft.com/office/drawing/2016/5/12/chartex" xmlns:cx7="http://schemas.microsoft.com/office/drawing/2016/5/13/chartex" xmlns:cx8="http://schemas.microsoft.com/office/drawing/2016/5/14/chartex" xmlns:mc="http://schemas.openxmlformats.org/markup-compatibility/2006" xmlns:aink="http://schemas.microsoft.com/office/drawing/2016/ink" xmlns:am3d="http://schemas.microsoft.com/office/drawing/2017/model3d" xmlns:o="urn:schemas-microsoft-com:office:office" xmlns:oel="http://schemas.microsoft.com/office/2019/extlst" xmlns:r="http://schemas.openxmlformats.org/officeDocument/2006/relationships" xmlns:m="http://schemas.openxmlformats.org/officeDocument/2006/math" xmlns:v="urn:schemas-microsoft-com:vml" xmlns:wp14="http://schemas.microsoft.com/office/word/2010/wordprocessingDrawing" xmlns:wp="http://schemas.openxmlformats.org/drawingml/2006/wordprocessingDrawing" xmlns:w10="urn:schemas-microsoft-com:office:word" xmlns:w="http://schemas.openxmlformats.org/wordprocessingml/2006/main" xmlns:w14="http://schemas.microsoft.com/office/word/2010/wordml" xmlns:w15="http://schemas.microsoft.com/office/word/2012/wordml" xmlns:w16cex="http://schemas.microsoft.com/office/word/2018/wordml/cex" xmlns:w16cid="http://schemas.microsoft.com/office/word/2016/wordml/cid" xmlns:w16="http://schemas.microsoft.com/office/word/2018/wordml" xmlns:w16du="http://schemas.microsoft.com/office/word/2023/wordml/word16du" xmlns:w16sdtdh="http://schemas.microsoft.com/office/word/2020/wordml/sdtdatahash" xmlns:w16sdtfl="http://schemas.microsoft.com/office/word/2024/wordml/sdtformatlock" xmlns:w16se="http://schemas.microsoft.com/office/word/2015/wordml/symex" xmlns:wpg="http://schemas.microsoft.com/office/word/2010/wordprocessingGroup" xmlns:wpi="http://schemas.microsoft.com/office/word/2010/wordprocessingInk" xmlns:wne="http://schemas.microsoft.com/office/word/2006/wordml" xmlns:wps="http://schemas.microsoft.com/office/word/2010/wordprocessingShape" mc:Ignorable="w14 w15 w16se w16cid w16 w16cex w16sdtdh w16sdtfl w16du wp14">
+<w:footnotes xmlns:wpc="http://schemas.microsoft.com/office/word/2010/wordprocessingCanvas" xmlns:cx="http://schemas.microsoft.com/office/drawing/2014/chartex" xmlns:cx1="http://schemas.microsoft.com/office/drawing/2015/9/8/chartex" xmlns:cx2="http://schemas.microsoft.com/office/drawing/2015/10/21/chartex" xmlns:cx3="http://schemas.microsoft.com/office/drawing/2016/5/9/chartex" xmlns:cx4="http://schemas.microsoft.com/office/drawing/2016/5/10/chartex" xmlns:cx5="http://schemas.microsoft.com/office/drawing/2016/5/11/chartex" xmlns:cx6="http://schemas.microsoft.com/office/drawing/2016/5/12/chartex" xmlns:cx7="http://schemas.microsoft.com/office/drawing/2016/5/13/chartex" xmlns:cx8="http://schemas.microsoft.com/office/drawing/2016/5/14/chartex" xmlns:mc="http://schemas.openxmlformats.org/markup-compatibility/2006" xmlns:m="http://schemas.openxmlformats.org/officeDocument/2006/math" xmlns:aink="http://schemas.microsoft.com/office/drawing/2016/ink" xmlns:am3d="http://schemas.microsoft.com/office/drawing/2017/model3d" xmlns:oel="http://schemas.microsoft.com/office/2019/extlst" xmlns:r="http://schemas.openxmlformats.org/officeDocument/2006/relationships" xmlns:wp14="http://schemas.microsoft.com/office/word/2010/wordprocessingDrawing" xmlns:wp="http://schemas.openxmlformats.org/drawingml/2006/wordprocessingDrawing" xmlns:wpg="http://schemas.microsoft.com/office/word/2010/wordprocessingGroup" xmlns:wpi="http://schemas.microsoft.com/office/word/2010/wordprocessingInk" xmlns:wps="http://schemas.microsoft.com/office/word/2010/wordprocessingShape" xmlns:o="urn:schemas-microsoft-com:office:office" xmlns:v="urn:schemas-microsoft-com:vml" xmlns:w10="urn:schemas-microsoft-com:office:word" xmlns:w="http://schemas.openxmlformats.org/wordprocessingml/2006/main" xmlns:w14="http://schemas.microsoft.com/office/word/2010/wordml" xmlns:w15="http://schemas.microsoft.com/office/word/2012/wordml" xmlns:w16cex="http://schemas.microsoft.com/office/word/2018/wordml/cex" xmlns:w16cid="http://schemas.microsoft.com/office/word/2016/wordml/cid" xmlns:w16="http://schemas.microsoft.com/office/word/2018/wordml" xmlns:w16sdtdh="http://schemas.microsoft.com/office/word/2020/wordml/sdtdatahash" xmlns:w16sdtfl="http://schemas.microsoft.com/office/word/2024/wordml/sdtformatlock" xmlns:w16se="http://schemas.microsoft.com/office/word/2015/wordml/symex" xmlns:w16du="http://schemas.microsoft.com/office/word/2023/wordml/word16du" xmlns:wne="http://schemas.microsoft.com/office/word/2006/wordml" mc:Ignorable="w14 w15 w16se w16cid w16 w16cex w16sdtdh w16sdtfl w16du wp14">
   <w:footnote w:type="separator" w:id="-1">
     <w:p>
       <w:pPr>
@@ -511,121 +877,168 @@
 </file>
 
 <file path=word/header1.xml><?xml version="1.0" encoding="utf-8"?>
-<w:hdr xmlns:wpc="http://schemas.microsoft.com/office/word/2010/wordprocessingCanvas" xmlns:cx="http://schemas.microsoft.com/office/drawing/2014/chartex" xmlns:cx1="http://schemas.microsoft.com/office/drawing/2015/9/8/chartex" xmlns:cx2="http://schemas.microsoft.com/office/drawing/2015/10/21/chartex" xmlns:cx3="http://schemas.microsoft.com/office/drawing/2016/5/9/chartex" xmlns:cx4="http://schemas.microsoft.com/office/drawing/2016/5/10/chartex" xmlns:cx5="http://schemas.microsoft.com/office/drawing/2016/5/11/chartex" xmlns:cx6="http://schemas.microsoft.com/office/drawing/2016/5/12/chartex" xmlns:cx7="http://schemas.microsoft.com/office/drawing/2016/5/13/chartex" xmlns:cx8="http://schemas.microsoft.com/office/drawing/2016/5/14/chartex" xmlns:mc="http://schemas.openxmlformats.org/markup-compatibility/2006" xmlns:aink="http://schemas.microsoft.com/office/drawing/2016/ink" xmlns:am3d="http://schemas.microsoft.com/office/drawing/2017/model3d" xmlns:o="urn:schemas-microsoft-com:office:office" xmlns:oel="http://schemas.microsoft.com/office/2019/extlst" xmlns:r="http://schemas.openxmlformats.org/officeDocument/2006/relationships" xmlns:m="http://schemas.openxmlformats.org/officeDocument/2006/math" xmlns:v="urn:schemas-microsoft-com:vml" xmlns:wp14="http://schemas.microsoft.com/office/word/2010/wordprocessingDrawing" xmlns:wp="http://schemas.openxmlformats.org/drawingml/2006/wordprocessingDrawing" xmlns:w10="urn:schemas-microsoft-com:office:word" xmlns:w="http://schemas.openxmlformats.org/wordprocessingml/2006/main" xmlns:w14="http://schemas.microsoft.com/office/word/2010/wordml" xmlns:w15="http://schemas.microsoft.com/office/word/2012/wordml" xmlns:w16cex="http://schemas.microsoft.com/office/word/2018/wordml/cex" xmlns:w16cid="http://schemas.microsoft.com/office/word/2016/wordml/cid" xmlns:w16="http://schemas.microsoft.com/office/word/2018/wordml" xmlns:w16du="http://schemas.microsoft.com/office/word/2023/wordml/word16du" xmlns:w16sdtdh="http://schemas.microsoft.com/office/word/2020/wordml/sdtdatahash" xmlns:w16sdtfl="http://schemas.microsoft.com/office/word/2024/wordml/sdtformatlock" xmlns:w16se="http://schemas.microsoft.com/office/word/2015/wordml/symex" xmlns:wpg="http://schemas.microsoft.com/office/word/2010/wordprocessingGroup" xmlns:wpi="http://schemas.microsoft.com/office/word/2010/wordprocessingInk" xmlns:wne="http://schemas.microsoft.com/office/word/2006/wordml" xmlns:wps="http://schemas.microsoft.com/office/word/2010/wordprocessingShape" mc:Ignorable="w14 w15 w16se w16cid w16 w16cex w16sdtdh w16sdtfl w16du wp14">
+<w:hdr xmlns:wpc="http://schemas.microsoft.com/office/word/2010/wordprocessingCanvas" xmlns:cx="http://schemas.microsoft.com/office/drawing/2014/chartex" xmlns:cx1="http://schemas.microsoft.com/office/drawing/2015/9/8/chartex" xmlns:cx2="http://schemas.microsoft.com/office/drawing/2015/10/21/chartex" xmlns:cx3="http://schemas.microsoft.com/office/drawing/2016/5/9/chartex" xmlns:cx4="http://schemas.microsoft.com/office/drawing/2016/5/10/chartex" xmlns:cx5="http://schemas.microsoft.com/office/drawing/2016/5/11/chartex" xmlns:cx6="http://schemas.microsoft.com/office/drawing/2016/5/12/chartex" xmlns:cx7="http://schemas.microsoft.com/office/drawing/2016/5/13/chartex" xmlns:cx8="http://schemas.microsoft.com/office/drawing/2016/5/14/chartex" xmlns:mc="http://schemas.openxmlformats.org/markup-compatibility/2006" xmlns:m="http://schemas.openxmlformats.org/officeDocument/2006/math" xmlns:aink="http://schemas.microsoft.com/office/drawing/2016/ink" xmlns:am3d="http://schemas.microsoft.com/office/drawing/2017/model3d" xmlns:oel="http://schemas.microsoft.com/office/2019/extlst" xmlns:r="http://schemas.openxmlformats.org/officeDocument/2006/relationships" xmlns:wp14="http://schemas.microsoft.com/office/word/2010/wordprocessingDrawing" xmlns:wp="http://schemas.openxmlformats.org/drawingml/2006/wordprocessingDrawing" xmlns:wpg="http://schemas.microsoft.com/office/word/2010/wordprocessingGroup" xmlns:wpi="http://schemas.microsoft.com/office/word/2010/wordprocessingInk" xmlns:wps="http://schemas.microsoft.com/office/word/2010/wordprocessingShape" xmlns:o="urn:schemas-microsoft-com:office:office" xmlns:v="urn:schemas-microsoft-com:vml" xmlns:w10="urn:schemas-microsoft-com:office:word" xmlns:w="http://schemas.openxmlformats.org/wordprocessingml/2006/main" xmlns:w14="http://schemas.microsoft.com/office/word/2010/wordml" xmlns:w15="http://schemas.microsoft.com/office/word/2012/wordml" xmlns:w16cex="http://schemas.microsoft.com/office/word/2018/wordml/cex" xmlns:w16cid="http://schemas.microsoft.com/office/word/2016/wordml/cid" xmlns:w16="http://schemas.microsoft.com/office/word/2018/wordml" xmlns:w16sdtdh="http://schemas.microsoft.com/office/word/2020/wordml/sdtdatahash" xmlns:w16sdtfl="http://schemas.microsoft.com/office/word/2024/wordml/sdtformatlock" xmlns:w16se="http://schemas.microsoft.com/office/word/2015/wordml/symex" xmlns:w16du="http://schemas.microsoft.com/office/word/2023/wordml/word16du" xmlns:wne="http://schemas.microsoft.com/office/word/2006/wordml" mc:Ignorable="w14 w15 w16se w16cid w16 w16cex w16sdtdh w16sdtfl w16du wp14">
   <w:p>
     <w:pPr>
       <w:pStyle w:val="Header"/>
-      <w:jc w:val="center"/>
     </w:pPr>
   </w:p>
 </w:hdr>
 </file>
 
 <file path=word/header2.xml><?xml version="1.0" encoding="utf-8"?>
-<w:hdr xmlns:wpc="http://schemas.microsoft.com/office/word/2010/wordprocessingCanvas" xmlns:cx="http://schemas.microsoft.com/office/drawing/2014/chartex" xmlns:cx1="http://schemas.microsoft.com/office/drawing/2015/9/8/chartex" xmlns:cx2="http://schemas.microsoft.com/office/drawing/2015/10/21/chartex" xmlns:cx3="http://schemas.microsoft.com/office/drawing/2016/5/9/chartex" xmlns:cx4="http://schemas.microsoft.com/office/drawing/2016/5/10/chartex" xmlns:cx5="http://schemas.microsoft.com/office/drawing/2016/5/11/chartex" xmlns:cx6="http://schemas.microsoft.com/office/drawing/2016/5/12/chartex" xmlns:cx7="http://schemas.microsoft.com/office/drawing/2016/5/13/chartex" xmlns:cx8="http://schemas.microsoft.com/office/drawing/2016/5/14/chartex" xmlns:mc="http://schemas.openxmlformats.org/markup-compatibility/2006" xmlns:aink="http://schemas.microsoft.com/office/drawing/2016/ink" xmlns:am3d="http://schemas.microsoft.com/office/drawing/2017/model3d" xmlns:o="urn:schemas-microsoft-com:office:office" xmlns:oel="http://schemas.microsoft.com/office/2019/extlst" xmlns:r="http://schemas.openxmlformats.org/officeDocument/2006/relationships" xmlns:m="http://schemas.openxmlformats.org/officeDocument/2006/math" xmlns:v="urn:schemas-microsoft-com:vml" xmlns:wp14="http://schemas.microsoft.com/office/word/2010/wordprocessingDrawing" xmlns:wp="http://schemas.openxmlformats.org/drawingml/2006/wordprocessingDrawing" xmlns:w10="urn:schemas-microsoft-com:office:word" xmlns:w="http://schemas.openxmlformats.org/wordprocessingml/2006/main" xmlns:w14="http://schemas.microsoft.com/office/word/2010/wordml" xmlns:w15="http://schemas.microsoft.com/office/word/2012/wordml" xmlns:w16cex="http://schemas.microsoft.com/office/word/2018/wordml/cex" xmlns:w16cid="http://schemas.microsoft.com/office/word/2016/wordml/cid" xmlns:w16="http://schemas.microsoft.com/office/word/2018/wordml" xmlns:w16du="http://schemas.microsoft.com/office/word/2023/wordml/word16du" xmlns:w16sdtdh="http://schemas.microsoft.com/office/word/2020/wordml/sdtdatahash" xmlns:w16sdtfl="http://schemas.microsoft.com/office/word/2024/wordml/sdtformatlock" xmlns:w16se="http://schemas.microsoft.com/office/word/2015/wordml/symex" xmlns:wpg="http://schemas.microsoft.com/office/word/2010/wordprocessingGroup" xmlns:wpi="http://schemas.microsoft.com/office/word/2010/wordprocessingInk" xmlns:wne="http://schemas.microsoft.com/office/word/2006/wordml" xmlns:wps="http://schemas.microsoft.com/office/word/2010/wordprocessingShape" mc:Ignorable="w14 w15 w16se w16cid w16 w16cex w16sdtdh w16sdtfl w16du wp14">
+<w:hdr xmlns:wpc="http://schemas.microsoft.com/office/word/2010/wordprocessingCanvas" xmlns:cx="http://schemas.microsoft.com/office/drawing/2014/chartex" xmlns:cx1="http://schemas.microsoft.com/office/drawing/2015/9/8/chartex" xmlns:cx2="http://schemas.microsoft.com/office/drawing/2015/10/21/chartex" xmlns:cx3="http://schemas.microsoft.com/office/drawing/2016/5/9/chartex" xmlns:cx4="http://schemas.microsoft.com/office/drawing/2016/5/10/chartex" xmlns:cx5="http://schemas.microsoft.com/office/drawing/2016/5/11/chartex" xmlns:cx6="http://schemas.microsoft.com/office/drawing/2016/5/12/chartex" xmlns:cx7="http://schemas.microsoft.com/office/drawing/2016/5/13/chartex" xmlns:cx8="http://schemas.microsoft.com/office/drawing/2016/5/14/chartex" xmlns:mc="http://schemas.openxmlformats.org/markup-compatibility/2006" xmlns:m="http://schemas.openxmlformats.org/officeDocument/2006/math" xmlns:aink="http://schemas.microsoft.com/office/drawing/2016/ink" xmlns:am3d="http://schemas.microsoft.com/office/drawing/2017/model3d" xmlns:oel="http://schemas.microsoft.com/office/2019/extlst" xmlns:r="http://schemas.openxmlformats.org/officeDocument/2006/relationships" xmlns:wp14="http://schemas.microsoft.com/office/word/2010/wordprocessingDrawing" xmlns:wp="http://schemas.openxmlformats.org/drawingml/2006/wordprocessingDrawing" xmlns:wpg="http://schemas.microsoft.com/office/word/2010/wordprocessingGroup" xmlns:wpi="http://schemas.microsoft.com/office/word/2010/wordprocessingInk" xmlns:wps="http://schemas.microsoft.com/office/word/2010/wordprocessingShape" xmlns:o="urn:schemas-microsoft-com:office:office" xmlns:v="urn:schemas-microsoft-com:vml" xmlns:w10="urn:schemas-microsoft-com:office:word" xmlns:w="http://schemas.openxmlformats.org/wordprocessingml/2006/main" xmlns:w14="http://schemas.microsoft.com/office/word/2010/wordml" xmlns:w15="http://schemas.microsoft.com/office/word/2012/wordml" xmlns:w16cex="http://schemas.microsoft.com/office/word/2018/wordml/cex" xmlns:w16cid="http://schemas.microsoft.com/office/word/2016/wordml/cid" xmlns:w16="http://schemas.microsoft.com/office/word/2018/wordml" xmlns:w16sdtdh="http://schemas.microsoft.com/office/word/2020/wordml/sdtdatahash" xmlns:w16sdtfl="http://schemas.microsoft.com/office/word/2024/wordml/sdtformatlock" xmlns:w16se="http://schemas.microsoft.com/office/word/2015/wordml/symex" xmlns:w16du="http://schemas.microsoft.com/office/word/2023/wordml/word16du" xmlns:wne="http://schemas.microsoft.com/office/word/2006/wordml" mc:Ignorable="w14 w15 w16se w16cid w16 w16cex w16sdtdh w16sdtfl w16du wp14">
   <w:p>
     <w:pPr>
       <w:pStyle w:val="Header"/>
       <w:jc w:val="center"/>
+    </w:pPr>
+  </w:p>
+</w:hdr>
+</file>
+
+<file path=word/header3.xml><?xml version="1.0" encoding="utf-8"?>
+<w:hdr xmlns:wpc="http://schemas.microsoft.com/office/word/2010/wordprocessingCanvas" xmlns:cx="http://schemas.microsoft.com/office/drawing/2014/chartex" xmlns:cx1="http://schemas.microsoft.com/office/drawing/2015/9/8/chartex" xmlns:cx2="http://schemas.microsoft.com/office/drawing/2015/10/21/chartex" xmlns:cx3="http://schemas.microsoft.com/office/drawing/2016/5/9/chartex" xmlns:cx4="http://schemas.microsoft.com/office/drawing/2016/5/10/chartex" xmlns:cx5="http://schemas.microsoft.com/office/drawing/2016/5/11/chartex" xmlns:cx6="http://schemas.microsoft.com/office/drawing/2016/5/12/chartex" xmlns:cx7="http://schemas.microsoft.com/office/drawing/2016/5/13/chartex" xmlns:cx8="http://schemas.microsoft.com/office/drawing/2016/5/14/chartex" xmlns:mc="http://schemas.openxmlformats.org/markup-compatibility/2006" xmlns:m="http://schemas.openxmlformats.org/officeDocument/2006/math" xmlns:aink="http://schemas.microsoft.com/office/drawing/2016/ink" xmlns:am3d="http://schemas.microsoft.com/office/drawing/2017/model3d" xmlns:oel="http://schemas.microsoft.com/office/2019/extlst" xmlns:r="http://schemas.openxmlformats.org/officeDocument/2006/relationships" xmlns:wp14="http://schemas.microsoft.com/office/word/2010/wordprocessingDrawing" xmlns:wp="http://schemas.openxmlformats.org/drawingml/2006/wordprocessingDrawing" xmlns:wpg="http://schemas.microsoft.com/office/word/2010/wordprocessingGroup" xmlns:wpi="http://schemas.microsoft.com/office/word/2010/wordprocessingInk" xmlns:wps="http://schemas.microsoft.com/office/word/2010/wordprocessingShape" xmlns:o="urn:schemas-microsoft-com:office:office" xmlns:v="urn:schemas-microsoft-com:vml" xmlns:w10="urn:schemas-microsoft-com:office:word" xmlns:w="http://schemas.openxmlformats.org/wordprocessingml/2006/main" xmlns:w14="http://schemas.microsoft.com/office/word/2010/wordml" xmlns:w15="http://schemas.microsoft.com/office/word/2012/wordml" xmlns:w16cex="http://schemas.microsoft.com/office/word/2018/wordml/cex" xmlns:w16cid="http://schemas.microsoft.com/office/word/2016/wordml/cid" xmlns:w16="http://schemas.microsoft.com/office/word/2018/wordml" xmlns:w16sdtdh="http://schemas.microsoft.com/office/word/2020/wordml/sdtdatahash" xmlns:w16sdtfl="http://schemas.microsoft.com/office/word/2024/wordml/sdtformatlock" xmlns:w16se="http://schemas.microsoft.com/office/word/2015/wordml/symex" xmlns:w16du="http://schemas.microsoft.com/office/word/2023/wordml/word16du" xmlns:wne="http://schemas.microsoft.com/office/word/2006/wordml" mc:Ignorable="w14 w15 w16se w16cid w16 w16cex w16sdtdh w16sdtfl w16du wp14">
+  <w:p>
+    <w:pPr>
+      <w:pStyle w:val="Header"/>
+    </w:pPr>
+    <w:fldSimple w:instr=" DOCPROPERTY &quot;doc_id&quot; \* MERGEFORMAT ">
+      <w:r>
+        <w:t>Doc ID</w:t>
+      </w:r>
+    </w:fldSimple>
+    <w:r>
+      <w:tab/>
+    </w:r>
+    <w:r>
       <w:rPr>
         <w:b/>
         <w:bCs/>
         <w:color w:val="EE0000"/>
-      </w:rPr>
-    </w:pPr>
-    <w:r>
-      <w:rPr>
-        <w:color w:val="F6F6F6"/>
-        <w:sz w:val="20"/>
-        <w:szCs w:val="20"/>
+        <w:sz w:val="21"/>
+        <w:szCs w:val="21"/>
       </w:rPr>
       <w:fldChar w:fldCharType="begin"/>
-    </w:r>
-    <w:r>
-      <w:rPr>
-        <w:color w:val="F6F6F6"/>
-        <w:sz w:val="20"/>
-        <w:szCs w:val="20"/>
-      </w:rPr>
-      <w:instrText xml:space="preserve"> DOCPROPERTY doc_id \* MERGEFORMAT </w:instrText>
-    </w:r>
-    <w:r>
-      <w:rPr>
-        <w:color w:val="F6F6F6"/>
-        <w:sz w:val="20"/>
-        <w:szCs w:val="20"/>
-      </w:rPr>
-      <w:fldChar w:fldCharType="separate"/>
-    </w:r>
-    <w:r>
-      <w:rPr>
-        <w:color w:val="F6F6F6"/>
-        <w:sz w:val="20"/>
-        <w:szCs w:val="20"/>
-      </w:rPr>
-      <w:t>Doc ID</w:t>
-    </w:r>
-    <w:r>
-      <w:rPr>
-        <w:color w:val="F6F6F6"/>
-        <w:sz w:val="20"/>
-        <w:szCs w:val="20"/>
-      </w:rPr>
-      <w:fldChar w:fldCharType="end"/>
     </w:r>
     <w:r>
       <w:rPr>
         <w:b/>
         <w:bCs/>
         <w:color w:val="EE0000"/>
-      </w:rPr>
-      <w:ptab w:relativeTo="margin" w:alignment="center" w:leader="none"/>
+        <w:sz w:val="21"/>
+        <w:szCs w:val="21"/>
+      </w:rPr>
+      <w:instrText xml:space="preserve"> DOCPROPERTY "CLASSIFICATION" \* MERGEFORMAT </w:instrText>
     </w:r>
     <w:r>
       <w:rPr>
         <w:b/>
         <w:bCs/>
         <w:color w:val="EE0000"/>
-      </w:rPr>
-      <w:fldChar w:fldCharType="begin"/>
+        <w:sz w:val="21"/>
+        <w:szCs w:val="21"/>
+      </w:rPr>
+      <w:fldChar w:fldCharType="separate"/>
     </w:r>
     <w:r>
       <w:rPr>
         <w:b/>
         <w:bCs/>
         <w:color w:val="EE0000"/>
-      </w:rPr>
-      <w:instrText xml:space="preserve"> DOCPROPERTY classification \* MERGEFORMAT </w:instrText>
+        <w:sz w:val="21"/>
+        <w:szCs w:val="21"/>
+      </w:rPr>
+      <w:t>CLASSIFICATION</w:t>
     </w:r>
     <w:r>
       <w:rPr>
         <w:b/>
         <w:bCs/>
         <w:color w:val="EE0000"/>
-      </w:rPr>
-      <w:fldChar w:fldCharType="separate"/>
-    </w:r>
-    <w:r>
+        <w:sz w:val="21"/>
+        <w:szCs w:val="21"/>
+      </w:rPr>
+      <w:fldChar w:fldCharType="end"/>
+    </w:r>
+    <w:r>
+      <w:tab/>
+    </w:r>
+  </w:p>
+</w:hdr>
+</file>
+
+<file path=word/header4.xml><?xml version="1.0" encoding="utf-8"?>
+<w:hdr xmlns:wpc="http://schemas.microsoft.com/office/word/2010/wordprocessingCanvas" xmlns:cx="http://schemas.microsoft.com/office/drawing/2014/chartex" xmlns:cx1="http://schemas.microsoft.com/office/drawing/2015/9/8/chartex" xmlns:cx2="http://schemas.microsoft.com/office/drawing/2015/10/21/chartex" xmlns:cx3="http://schemas.microsoft.com/office/drawing/2016/5/9/chartex" xmlns:cx4="http://schemas.microsoft.com/office/drawing/2016/5/10/chartex" xmlns:cx5="http://schemas.microsoft.com/office/drawing/2016/5/11/chartex" xmlns:cx6="http://schemas.microsoft.com/office/drawing/2016/5/12/chartex" xmlns:cx7="http://schemas.microsoft.com/office/drawing/2016/5/13/chartex" xmlns:cx8="http://schemas.microsoft.com/office/drawing/2016/5/14/chartex" xmlns:mc="http://schemas.openxmlformats.org/markup-compatibility/2006" xmlns:m="http://schemas.openxmlformats.org/officeDocument/2006/math" xmlns:aink="http://schemas.microsoft.com/office/drawing/2016/ink" xmlns:am3d="http://schemas.microsoft.com/office/drawing/2017/model3d" xmlns:oel="http://schemas.microsoft.com/office/2019/extlst" xmlns:r="http://schemas.openxmlformats.org/officeDocument/2006/relationships" xmlns:wp14="http://schemas.microsoft.com/office/word/2010/wordprocessingDrawing" xmlns:wp="http://schemas.openxmlformats.org/drawingml/2006/wordprocessingDrawing" xmlns:wpg="http://schemas.microsoft.com/office/word/2010/wordprocessingGroup" xmlns:wpi="http://schemas.microsoft.com/office/word/2010/wordprocessingInk" xmlns:wps="http://schemas.microsoft.com/office/word/2010/wordprocessingShape" xmlns:o="urn:schemas-microsoft-com:office:office" xmlns:v="urn:schemas-microsoft-com:vml" xmlns:w10="urn:schemas-microsoft-com:office:word" xmlns:w="http://schemas.openxmlformats.org/wordprocessingml/2006/main" xmlns:w14="http://schemas.microsoft.com/office/word/2010/wordml" xmlns:w15="http://schemas.microsoft.com/office/word/2012/wordml" xmlns:w16cex="http://schemas.microsoft.com/office/word/2018/wordml/cex" xmlns:w16cid="http://schemas.microsoft.com/office/word/2016/wordml/cid" xmlns:w16="http://schemas.microsoft.com/office/word/2018/wordml" xmlns:w16sdtdh="http://schemas.microsoft.com/office/word/2020/wordml/sdtdatahash" xmlns:w16sdtfl="http://schemas.microsoft.com/office/word/2024/wordml/sdtformatlock" xmlns:w16se="http://schemas.microsoft.com/office/word/2015/wordml/symex" xmlns:w16du="http://schemas.microsoft.com/office/word/2023/wordml/word16du" xmlns:wne="http://schemas.microsoft.com/office/word/2006/wordml" mc:Ignorable="w14 w15 w16se w16cid w16 w16cex w16sdtdh w16sdtfl w16du wp14">
+  <w:p>
+    <w:pPr>
+      <w:pStyle w:val="Header"/>
+      <w:jc w:val="center"/>
       <w:rPr>
         <w:b/>
         <w:bCs/>
         <w:color w:val="EE0000"/>
-      </w:rPr>
-      <w:t>OFFICIAL</w:t>
+        <w:sz w:val="22"/>
+        <w:szCs w:val="22"/>
+      </w:rPr>
+    </w:pPr>
+    <w:r>
+      <w:rPr>
+        <w:color w:val="000000" w:themeColor="text1"/>
+        <w:sz w:val="18"/>
+        <w:szCs w:val="18"/>
+      </w:rPr>
+      <w:fldChar w:fldCharType="begin"/>
+    </w:r>
+    <w:r>
+      <w:rPr>
+        <w:color w:val="000000" w:themeColor="text1"/>
+        <w:sz w:val="18"/>
+        <w:szCs w:val="18"/>
+      </w:rPr>
+      <w:instrText xml:space="preserve"> DOCPROPERTY doc_id \* MERGEFORMAT </w:instrText>
+    </w:r>
+    <w:r>
+      <w:rPr>
+        <w:color w:val="000000" w:themeColor="text1"/>
+        <w:sz w:val="18"/>
+        <w:szCs w:val="18"/>
+      </w:rPr>
+      <w:fldChar w:fldCharType="separate"/>
+    </w:r>
+    <w:r>
+      <w:rPr>
+        <w:color w:val="000000" w:themeColor="text1"/>
+        <w:sz w:val="18"/>
+        <w:szCs w:val="18"/>
+      </w:rPr>
+      <w:t>Doc ID</w:t>
+    </w:r>
+    <w:r>
+      <w:rPr>
+        <w:color w:val="000000" w:themeColor="text1"/>
+        <w:sz w:val="18"/>
+        <w:szCs w:val="18"/>
+      </w:rPr>
+      <w:fldChar w:fldCharType="end"/>
     </w:r>
     <w:r>
       <w:rPr>
         <w:b/>
         <w:bCs/>
         <w:color w:val="EE0000"/>
-      </w:rPr>
-      <w:fldChar w:fldCharType="end"/>
+        <w:sz w:val="22"/>
+        <w:szCs w:val="22"/>
+      </w:rPr>
+      <w:ptab w:relativeTo="margin" w:alignment="center" w:leader="none"/>
     </w:r>
     <w:r>
       <w:rPr>
         <w:b/>
         <w:bCs/>
         <w:color w:val="EE0000"/>
+        <w:sz w:val="22"/>
+        <w:szCs w:val="22"/>
       </w:rPr>
       <w:fldChar w:fldCharType="begin"/>
     </w:r>
@@ -634,14 +1047,18 @@
         <w:b/>
         <w:bCs/>
         <w:color w:val="EE0000"/>
-      </w:rPr>
-      <w:instrText xml:space="preserve"> DOCPROPERTY  \* MERGEFORMAT </w:instrText>
+        <w:sz w:val="22"/>
+        <w:szCs w:val="22"/>
+      </w:rPr>
+      <w:instrText xml:space="preserve"> DOCPROPERTY classification \* MERGEFORMAT </w:instrText>
     </w:r>
     <w:r>
       <w:rPr>
         <w:b/>
         <w:bCs/>
         <w:color w:val="EE0000"/>
+        <w:sz w:val="22"/>
+        <w:szCs w:val="22"/>
       </w:rPr>
       <w:fldChar w:fldCharType="separate"/>
     </w:r>
@@ -650,23 +1067,83 @@
         <w:b/>
         <w:bCs/>
         <w:color w:val="EE0000"/>
-      </w:rPr>
-      <w:fldChar w:fldCharType="end"/>
+        <w:sz w:val="22"/>
+        <w:szCs w:val="22"/>
+      </w:rPr>
+      <w:t>CLASSIFICATION</w:t>
     </w:r>
     <w:r>
       <w:rPr>
         <w:b/>
         <w:bCs/>
         <w:color w:val="EE0000"/>
+        <w:sz w:val="22"/>
+        <w:szCs w:val="22"/>
+      </w:rPr>
+      <w:fldChar w:fldCharType="end"/>
+    </w:r>
+    <w:r>
+      <w:rPr>
+        <w:b/>
+        <w:bCs/>
+        <w:color w:val="EE0000"/>
+        <w:sz w:val="22"/>
+        <w:szCs w:val="22"/>
+      </w:rPr>
+      <w:fldChar w:fldCharType="begin"/>
+    </w:r>
+    <w:r>
+      <w:rPr>
+        <w:b/>
+        <w:bCs/>
+        <w:color w:val="EE0000"/>
+        <w:sz w:val="22"/>
+        <w:szCs w:val="22"/>
+      </w:rPr>
+      <w:instrText xml:space="preserve"> DOCPROPERTY  \* MERGEFORMAT </w:instrText>
+    </w:r>
+    <w:r>
+      <w:rPr>
+        <w:b/>
+        <w:bCs/>
+        <w:color w:val="EE0000"/>
+        <w:sz w:val="22"/>
+        <w:szCs w:val="22"/>
+      </w:rPr>
+      <w:fldChar w:fldCharType="separate"/>
+    </w:r>
+    <w:r>
+      <w:rPr>
+        <w:b/>
+        <w:bCs/>
+        <w:color w:val="EE0000"/>
+        <w:sz w:val="22"/>
+        <w:szCs w:val="22"/>
+      </w:rPr>
+      <w:fldChar w:fldCharType="end"/>
+    </w:r>
+    <w:r>
+      <w:rPr>
+        <w:b/>
+        <w:bCs/>
+        <w:color w:val="EE0000"/>
+        <w:sz w:val="22"/>
+        <w:szCs w:val="22"/>
       </w:rPr>
       <w:ptab w:relativeTo="margin" w:alignment="right" w:leader="none"/>
     </w:r>
+  </w:p>
+  <w:p>
+    <w:pPr>
+      <w:pStyle w:val="Header"/>
+      <w:jc w:val="center"/>
+    </w:pPr>
   </w:p>
 </w:hdr>
 </file>
 
 <file path=word/styles.xml><?xml version="1.0" encoding="utf-8"?>
-<w:styles xmlns:mc="http://schemas.openxmlformats.org/markup-compatibility/2006" xmlns:r="http://schemas.openxmlformats.org/officeDocument/2006/relationships" xmlns:w="http://schemas.openxmlformats.org/wordprocessingml/2006/main" xmlns:w14="http://schemas.microsoft.com/office/word/2010/wordml" xmlns:w15="http://schemas.microsoft.com/office/word/2012/wordml" xmlns:w16cex="http://schemas.microsoft.com/office/word/2018/wordml/cex" xmlns:w16cid="http://schemas.microsoft.com/office/word/2016/wordml/cid" xmlns:w16="http://schemas.microsoft.com/office/word/2018/wordml" xmlns:w16du="http://schemas.microsoft.com/office/word/2023/wordml/word16du" xmlns:w16sdtdh="http://schemas.microsoft.com/office/word/2020/wordml/sdtdatahash" xmlns:w16sdtfl="http://schemas.microsoft.com/office/word/2024/wordml/sdtformatlock" xmlns:w16se="http://schemas.microsoft.com/office/word/2015/wordml/symex" mc:Ignorable="w14 w15 w16se w16cid w16 w16cex w16sdtdh w16sdtfl w16du">
+<w:styles xmlns:mc="http://schemas.openxmlformats.org/markup-compatibility/2006" xmlns:r="http://schemas.openxmlformats.org/officeDocument/2006/relationships" xmlns:w="http://schemas.openxmlformats.org/wordprocessingml/2006/main" xmlns:w14="http://schemas.microsoft.com/office/word/2010/wordml" xmlns:w15="http://schemas.microsoft.com/office/word/2012/wordml" xmlns:w16cex="http://schemas.microsoft.com/office/word/2018/wordml/cex" xmlns:w16cid="http://schemas.microsoft.com/office/word/2016/wordml/cid" xmlns:w16="http://schemas.microsoft.com/office/word/2018/wordml" xmlns:w16sdtdh="http://schemas.microsoft.com/office/word/2020/wordml/sdtdatahash" xmlns:w16sdtfl="http://schemas.microsoft.com/office/word/2024/wordml/sdtformatlock" xmlns:w16se="http://schemas.microsoft.com/office/word/2015/wordml/symex" xmlns:w16du="http://schemas.microsoft.com/office/word/2023/wordml/word16du" mc:Ignorable="w14 w15 w16se w16cid w16 w16cex w16sdtdh w16sdtfl w16du">
   <w:docDefaults>
     <w:rPrDefault>
       <w:rPr>
@@ -1674,6 +2151,238 @@
     <w:unhideWhenUsed/>
     <w:rsid w:val="0076638D"/>
   </w:style>
+  <w:style w:type="paragraph" w:styleId="TOCHeading">
+    <w:name w:val="TOC Heading"/>
+    <w:basedOn w:val="Heading1"/>
+    <w:next w:val="Normal"/>
+    <w:uiPriority w:val="39"/>
+    <w:unhideWhenUsed/>
+    <w:qFormat/>
+    <w:rsid w:val="005A13C4"/>
+    <w:pPr>
+      <w:spacing w:before="480" w:after="0" w:line="276" w:lineRule="auto"/>
+      <w:outlineLvl w:val="9"/>
+    </w:pPr>
+    <w:rPr>
+      <w:b/>
+      <w:bCs/>
+      <w:kern w:val="0"/>
+      <w:sz w:val="28"/>
+      <w:szCs w:val="28"/>
+      <w:lang w:val="en-US"/>
+      <w14:ligatures w14:val="none"/>
+    </w:rPr>
+  </w:style>
+  <w:style w:type="paragraph" w:styleId="TOC1">
+    <w:name w:val="toc 1"/>
+    <w:basedOn w:val="Normal"/>
+    <w:next w:val="Normal"/>
+    <w:autoRedefine/>
+    <w:uiPriority w:val="39"/>
+    <w:semiHidden/>
+    <w:unhideWhenUsed/>
+    <w:rsid w:val="005A13C4"/>
+    <w:pPr>
+      <w:spacing w:before="120" w:after="0"/>
+    </w:pPr>
+    <w:rPr>
+      <w:rFonts w:cstheme="minorHAnsi"/>
+      <w:b/>
+      <w:bCs/>
+      <w:i/>
+      <w:iCs/>
+    </w:rPr>
+  </w:style>
+  <w:style w:type="paragraph" w:styleId="TOC2">
+    <w:name w:val="toc 2"/>
+    <w:basedOn w:val="Normal"/>
+    <w:next w:val="Normal"/>
+    <w:autoRedefine/>
+    <w:uiPriority w:val="39"/>
+    <w:semiHidden/>
+    <w:unhideWhenUsed/>
+    <w:rsid w:val="005A13C4"/>
+    <w:pPr>
+      <w:spacing w:before="120" w:after="0"/>
+      <w:ind w:left="240"/>
+    </w:pPr>
+    <w:rPr>
+      <w:rFonts w:cstheme="minorHAnsi"/>
+      <w:b/>
+      <w:bCs/>
+      <w:sz w:val="22"/>
+      <w:szCs w:val="22"/>
+    </w:rPr>
+  </w:style>
+  <w:style w:type="paragraph" w:styleId="TOC3">
+    <w:name w:val="toc 3"/>
+    <w:basedOn w:val="Normal"/>
+    <w:next w:val="Normal"/>
+    <w:autoRedefine/>
+    <w:uiPriority w:val="39"/>
+    <w:semiHidden/>
+    <w:unhideWhenUsed/>
+    <w:rsid w:val="005A13C4"/>
+    <w:pPr>
+      <w:spacing w:after="0"/>
+      <w:ind w:left="480"/>
+    </w:pPr>
+    <w:rPr>
+      <w:rFonts w:cstheme="minorHAnsi"/>
+      <w:sz w:val="20"/>
+      <w:szCs w:val="20"/>
+    </w:rPr>
+  </w:style>
+  <w:style w:type="paragraph" w:styleId="TOC4">
+    <w:name w:val="toc 4"/>
+    <w:basedOn w:val="Normal"/>
+    <w:next w:val="Normal"/>
+    <w:autoRedefine/>
+    <w:uiPriority w:val="39"/>
+    <w:semiHidden/>
+    <w:unhideWhenUsed/>
+    <w:rsid w:val="005A13C4"/>
+    <w:pPr>
+      <w:spacing w:after="0"/>
+      <w:ind w:left="720"/>
+    </w:pPr>
+    <w:rPr>
+      <w:rFonts w:cstheme="minorHAnsi"/>
+      <w:sz w:val="20"/>
+      <w:szCs w:val="20"/>
+    </w:rPr>
+  </w:style>
+  <w:style w:type="paragraph" w:styleId="TOC5">
+    <w:name w:val="toc 5"/>
+    <w:basedOn w:val="Normal"/>
+    <w:next w:val="Normal"/>
+    <w:autoRedefine/>
+    <w:uiPriority w:val="39"/>
+    <w:semiHidden/>
+    <w:unhideWhenUsed/>
+    <w:rsid w:val="005A13C4"/>
+    <w:pPr>
+      <w:spacing w:after="0"/>
+      <w:ind w:left="960"/>
+    </w:pPr>
+    <w:rPr>
+      <w:rFonts w:cstheme="minorHAnsi"/>
+      <w:sz w:val="20"/>
+      <w:szCs w:val="20"/>
+    </w:rPr>
+  </w:style>
+  <w:style w:type="paragraph" w:styleId="TOC6">
+    <w:name w:val="toc 6"/>
+    <w:basedOn w:val="Normal"/>
+    <w:next w:val="Normal"/>
+    <w:autoRedefine/>
+    <w:uiPriority w:val="39"/>
+    <w:semiHidden/>
+    <w:unhideWhenUsed/>
+    <w:rsid w:val="005A13C4"/>
+    <w:pPr>
+      <w:spacing w:after="0"/>
+      <w:ind w:left="1200"/>
+    </w:pPr>
+    <w:rPr>
+      <w:rFonts w:cstheme="minorHAnsi"/>
+      <w:sz w:val="20"/>
+      <w:szCs w:val="20"/>
+    </w:rPr>
+  </w:style>
+  <w:style w:type="paragraph" w:styleId="TOC7">
+    <w:name w:val="toc 7"/>
+    <w:basedOn w:val="Normal"/>
+    <w:next w:val="Normal"/>
+    <w:autoRedefine/>
+    <w:uiPriority w:val="39"/>
+    <w:semiHidden/>
+    <w:unhideWhenUsed/>
+    <w:rsid w:val="005A13C4"/>
+    <w:pPr>
+      <w:spacing w:after="0"/>
+      <w:ind w:left="1440"/>
+    </w:pPr>
+    <w:rPr>
+      <w:rFonts w:cstheme="minorHAnsi"/>
+      <w:sz w:val="20"/>
+      <w:szCs w:val="20"/>
+    </w:rPr>
+  </w:style>
+  <w:style w:type="paragraph" w:styleId="TOC8">
+    <w:name w:val="toc 8"/>
+    <w:basedOn w:val="Normal"/>
+    <w:next w:val="Normal"/>
+    <w:autoRedefine/>
+    <w:uiPriority w:val="39"/>
+    <w:semiHidden/>
+    <w:unhideWhenUsed/>
+    <w:rsid w:val="005A13C4"/>
+    <w:pPr>
+      <w:spacing w:after="0"/>
+      <w:ind w:left="1680"/>
+    </w:pPr>
+    <w:rPr>
+      <w:rFonts w:cstheme="minorHAnsi"/>
+      <w:sz w:val="20"/>
+      <w:szCs w:val="20"/>
+    </w:rPr>
+  </w:style>
+  <w:style w:type="paragraph" w:styleId="TOC9">
+    <w:name w:val="toc 9"/>
+    <w:basedOn w:val="Normal"/>
+    <w:next w:val="Normal"/>
+    <w:autoRedefine/>
+    <w:uiPriority w:val="39"/>
+    <w:semiHidden/>
+    <w:unhideWhenUsed/>
+    <w:rsid w:val="005A13C4"/>
+    <w:pPr>
+      <w:spacing w:after="0"/>
+      <w:ind w:left="1920"/>
+    </w:pPr>
+    <w:rPr>
+      <w:rFonts w:cstheme="minorHAnsi"/>
+      <w:sz w:val="20"/>
+      <w:szCs w:val="20"/>
+    </w:rPr>
+  </w:style>
+  <w:style w:type="paragraph" w:customStyle="1" w:styleId="ImageCaption">
+    <w:name w:val="Image Caption"/>
+    <w:basedOn w:val="Normal"/>
+    <w:qFormat/>
+    <w:rsid w:val="00702300"/>
+    <w:pPr>
+      <w:jc w:val="center"/>
+    </w:pPr>
+    <w:rPr>
+      <w:i/>
+      <w:iCs/>
+      <w:sz w:val="21"/>
+      <w:szCs w:val="21"/>
+    </w:rPr>
+  </w:style>
+  <w:style w:type="paragraph" w:customStyle="1" w:styleId="CaptionedFigure">
+    <w:name w:val="Captioned Figure"/>
+    <w:basedOn w:val="Normal"/>
+    <w:qFormat/>
+    <w:rsid w:val="00702300"/>
+    <w:pPr>
+      <w:jc w:val="center"/>
+    </w:pPr>
+  </w:style>
+  <w:style w:type="paragraph" w:styleId="TableofFigures">
+    <w:name w:val="table of figures"/>
+    <w:basedOn w:val="Normal"/>
+    <w:next w:val="Normal"/>
+    <w:uiPriority w:val="99"/>
+    <w:semiHidden/>
+    <w:unhideWhenUsed/>
+    <w:rsid w:val="00E272C2"/>
+    <w:pPr>
+      <w:spacing w:after="0"/>
+    </w:pPr>
+  </w:style>
 </w:styles>
 </file>
 
@@ -1970,4 +2679,16 @@
     </a:ext>
   </a:extLst>
 </a:theme>
+</file>
+
+<file path=customXml/item1.xml><?xml version="1.0" encoding="utf-8"?>
+<b:Sources xmlns:b="http://schemas.openxmlformats.org/officeDocument/2006/bibliography" xmlns="http://schemas.openxmlformats.org/officeDocument/2006/bibliography" SelectedStyle="/APASixthEditionOfficeOnline.xsl" StyleName="APA" Version="6"/>
+</file>
+
+<file path=customXml/itemProps1.xml><?xml version="1.0" encoding="utf-8"?>
+<ds:datastoreItem xmlns:ds="http://schemas.openxmlformats.org/officeDocument/2006/customXml" ds:itemID="{81A5571A-5A2B-4A4C-A7FC-6AE5AA588AC8}">
+  <ds:schemaRefs>
+    <ds:schemaRef ds:uri="http://schemas.openxmlformats.org/officeDocument/2006/bibliography"/>
+  </ds:schemaRefs>
+</ds:datastoreItem>
 </file>
</xml_diff>

<commit_message>
feat: Add revision within a docx bookmark
</commit_message>
<xml_diff>
--- a/svd_example/reference_doc.docx
+++ b/svd_example/reference_doc.docx
@@ -140,16 +140,15 @@
       </w:r>
     </w:p>
     <w:p/>
-    <w:p/>
     <w:p>
       <w:pPr>
         <w:sectPr>
-          <w:headerReference w:type="even" r:id="rId7"/>
-          <w:headerReference w:type="default" r:id="rId8"/>
-          <w:footerReference w:type="even" r:id="rId9"/>
-          <w:footerReference w:type="default" r:id="rId10"/>
-          <w:headerReference w:type="first" r:id="rId11"/>
-          <w:footerReference w:type="first" r:id="rId12"/>
+          <w:headerReference w:type="even" r:id="rId8"/>
+          <w:headerReference w:type="default" r:id="rId9"/>
+          <w:footerReference w:type="even" r:id="rId10"/>
+          <w:footerReference w:type="default" r:id="rId11"/>
+          <w:headerReference w:type="first" r:id="rId12"/>
+          <w:footerReference w:type="first" r:id="rId13"/>
           <w:pgSz w:w="11906" w:h="16838"/>
           <w:pgMar w:top="1440" w:right="1440" w:bottom="1440" w:left="1440" w:header="708" w:footer="708" w:gutter="0"/>
           <w:cols w:space="708"/>
@@ -157,7 +156,123 @@
         </w:sectPr>
       </w:pPr>
     </w:p>
+    <w:p>
+      <w:pPr>
+        <w:pStyle w:val="TOCHeading"/>
+      </w:pPr>
+      <w:r>
+        <w:lastRenderedPageBreak/>
+        <w:t>Revision History</w:t>
+      </w:r>
+    </w:p>
+    <w:p>
+      <w:pPr>
+        <w:rPr>
+          <w:lang w:val="en-US"/>
+        </w:rPr>
+      </w:pPr>
+      <w:bookmarkStart w:id="0" w:name="Revision_table"/>
+    </w:p>
+    <w:tbl>
+      <w:tblPr>
+        <w:tblStyle w:val="table0"/>
+        <w:tblW w:w="0" w:type="auto"/>
+        <w:tblLook w:val="04A0" w:firstRow="1" w:lastRow="0" w:firstColumn="1" w:lastColumn="0" w:noHBand="0" w:noVBand="1"/>
+      </w:tblPr>
+      <w:tblGrid>
+        <w:gridCol w:w="1696"/>
+        <w:gridCol w:w="2410"/>
+        <w:gridCol w:w="4910"/>
+      </w:tblGrid>
+      <w:tr>
+        <w:trPr>
+          <w:cnfStyle w:val="100000000000" w:firstRow="1" w:lastRow="0" w:firstColumn="0" w:lastColumn="0" w:oddVBand="0" w:evenVBand="0" w:oddHBand="0" w:evenHBand="0" w:firstRowFirstColumn="0" w:firstRowLastColumn="0" w:lastRowFirstColumn="0" w:lastRowLastColumn="0"/>
+        </w:trPr>
+        <w:tc>
+          <w:tcPr>
+            <w:tcW w:w="1696" w:type="dxa"/>
+          </w:tcPr>
+          <w:p>
+            <w:pPr>
+              <w:spacing w:after="96"/>
+              <w:rPr>
+                <w:b w:val="0"/>
+                <w:bCs/>
+              </w:rPr>
+            </w:pPr>
+            <w:r>
+              <w:rPr>
+                <w:bCs/>
+              </w:rPr>
+              <w:t>Revis</w:t>
+            </w:r>
+            <w:r>
+              <w:rPr>
+                <w:bCs/>
+              </w:rPr>
+              <w:t>i</w:t>
+            </w:r>
+            <w:r>
+              <w:rPr>
+                <w:bCs/>
+              </w:rPr>
+              <w:t>on</w:t>
+            </w:r>
+          </w:p>
+        </w:tc>
+        <w:tc>
+          <w:tcPr>
+            <w:tcW w:w="2410" w:type="dxa"/>
+          </w:tcPr>
+          <w:p>
+            <w:pPr>
+              <w:spacing w:after="96"/>
+              <w:rPr>
+                <w:b w:val="0"/>
+                <w:bCs/>
+              </w:rPr>
+            </w:pPr>
+            <w:r>
+              <w:rPr>
+                <w:bCs/>
+              </w:rPr>
+              <w:t>Name</w:t>
+            </w:r>
+          </w:p>
+        </w:tc>
+        <w:tc>
+          <w:tcPr>
+            <w:tcW w:w="4910" w:type="dxa"/>
+          </w:tcPr>
+          <w:p>
+            <w:pPr>
+              <w:spacing w:after="96"/>
+              <w:rPr>
+                <w:b w:val="0"/>
+                <w:bCs/>
+              </w:rPr>
+            </w:pPr>
+            <w:r>
+              <w:rPr>
+                <w:bCs/>
+              </w:rPr>
+              <w:t>Description</w:t>
+            </w:r>
+          </w:p>
+        </w:tc>
+      </w:tr>
+      <w:bookmarkEnd w:id="0"/>
+    </w:tbl>
     <w:p/>
+    <w:p>
+      <w:r>
+        <w:rPr>
+          <w:b/>
+          <w:bCs/>
+        </w:rPr>
+        <w:br w:type="page"/>
+      </w:r>
+    </w:p>
     <w:sdt>
       <w:sdtPr>
         <w:rPr>
@@ -186,6 +301,17 @@
         <w:p>
           <w:pPr>
             <w:pStyle w:val="TOCHeading"/>
+            <w:rPr>
+              <w:rFonts w:asciiTheme="minorHAnsi" w:eastAsiaTheme="minorHAnsi" w:hAnsiTheme="minorHAnsi" w:cstheme="minorBidi"/>
+              <w:b w:val="0"/>
+              <w:bCs w:val="0"/>
+              <w:color w:val="auto"/>
+              <w:kern w:val="2"/>
+              <w:sz w:val="24"/>
+              <w:szCs w:val="24"/>
+              <w:lang w:val="en-AU"/>
+              <w14:ligatures w14:val="standardContextual"/>
+            </w:rPr>
           </w:pPr>
           <w:r>
             <w:t>Table of Contents</w:t>
@@ -195,8 +321,6 @@
           <w:fldSimple w:instr=" TOC \o &quot;1-3&quot; \h \z \u ">
             <w:r>
               <w:rPr>
-                <w:b/>
-                <w:bCs/>
                 <w:noProof/>
                 <w:lang w:val="en-GB"/>
               </w:rPr>
@@ -206,7 +330,31 @@
         </w:p>
       </w:sdtContent>
     </w:sdt>
-    <w:p/>
+    <w:p>
+      <w:pPr>
+        <w:pStyle w:val="TOCHeading"/>
+      </w:pPr>
+      <w:r>
+        <w:t>Table of Figures</w:t>
+      </w:r>
+    </w:p>
+    <w:p>
+      <w:pPr>
+        <w:rPr>
+          <w:noProof/>
+          <w:lang w:val="en-GB"/>
+        </w:rPr>
+      </w:pPr>
+      <w:fldSimple w:instr=" TOC \h \z \t &quot;Image Caption&quot; \c ">
+        <w:r>
+          <w:rPr>
+            <w:noProof/>
+            <w:lang w:val="en-GB"/>
+          </w:rPr>
+          <w:t>No table of figures entries found.</w:t>
+        </w:r>
+      </w:fldSimple>
+    </w:p>
     <w:p>
       <w:pPr>
         <w:pStyle w:val="TOCHeading"/>
@@ -224,36 +372,55 @@
           <w:lang w:val="en-GB"/>
         </w:rPr>
       </w:pPr>
-      <w:fldSimple w:instr=" TOC \h \z \t &quot;Image Caption&quot; \c ">
-        <w:r>
-          <w:rPr>
-            <w:b/>
-            <w:bCs/>
-            <w:noProof/>
-            <w:lang w:val="en-GB"/>
-          </w:rPr>
-          <w:t>No table of figures entries found.</w:t>
-        </w:r>
-      </w:fldSimple>
-    </w:p>
-    <w:p>
-      <w:pPr>
+      <w:r>
         <w:rPr>
           <w:b/>
           <w:bCs/>
           <w:noProof/>
           <w:lang w:val="en-GB"/>
         </w:rPr>
-      </w:pPr>
-    </w:p>
-    <w:p>
+        <w:fldChar w:fldCharType="begin"/>
+      </w:r>
+      <w:r>
+        <w:rPr>
+          <w:b/>
+          <w:bCs/>
+          <w:noProof/>
+          <w:lang w:val="en-GB"/>
+        </w:rPr>
+        <w:instrText xml:space="preserve"> TOC \h \z \t "Table Caption" \c </w:instrText>
+      </w:r>
+      <w:r>
+        <w:rPr>
+          <w:b/>
+          <w:bCs/>
+          <w:noProof/>
+          <w:lang w:val="en-GB"/>
+        </w:rPr>
+        <w:fldChar w:fldCharType="separate"/>
+      </w:r>
+      <w:r>
+        <w:rPr>
+          <w:noProof/>
+          <w:lang w:val="en-GB"/>
+        </w:rPr>
+        <w:t>No table of figures entries found.</w:t>
+      </w:r>
+      <w:r>
+        <w:rPr>
+          <w:b/>
+          <w:bCs/>
+          <w:noProof/>
+          <w:lang w:val="en-GB"/>
+        </w:rPr>
+        <w:fldChar w:fldCharType="end"/>
+      </w:r>
       <w:r>
         <w:br w:type="page"/>
       </w:r>
     </w:p>
-    <w:p/>
     <w:sectPr>
-      <w:headerReference w:type="default" r:id="rId13"/>
+      <w:headerReference w:type="default" r:id="rId14"/>
       <w:pgSz w:w="11906" w:h="16838"/>
       <w:pgMar w:top="1440" w:right="1440" w:bottom="1440" w:left="1440" w:header="708" w:footer="708" w:gutter="0"/>
       <w:cols w:space="708"/>
@@ -301,275 +468,321 @@
 
 <file path=word/footer2.xml><?xml version="1.0" encoding="utf-8"?>
 <w:ftr xmlns:wpc="http://schemas.microsoft.com/office/word/2010/wordprocessingCanvas" xmlns:cx="http://schemas.microsoft.com/office/drawing/2014/chartex" xmlns:cx1="http://schemas.microsoft.com/office/drawing/2015/9/8/chartex" xmlns:cx2="http://schemas.microsoft.com/office/drawing/2015/10/21/chartex" xmlns:cx3="http://schemas.microsoft.com/office/drawing/2016/5/9/chartex" xmlns:cx4="http://schemas.microsoft.com/office/drawing/2016/5/10/chartex" xmlns:cx5="http://schemas.microsoft.com/office/drawing/2016/5/11/chartex" xmlns:cx6="http://schemas.microsoft.com/office/drawing/2016/5/12/chartex" xmlns:cx7="http://schemas.microsoft.com/office/drawing/2016/5/13/chartex" xmlns:cx8="http://schemas.microsoft.com/office/drawing/2016/5/14/chartex" xmlns:mc="http://schemas.openxmlformats.org/markup-compatibility/2006" xmlns:m="http://schemas.openxmlformats.org/officeDocument/2006/math" xmlns:aink="http://schemas.microsoft.com/office/drawing/2016/ink" xmlns:am3d="http://schemas.microsoft.com/office/drawing/2017/model3d" xmlns:oel="http://schemas.microsoft.com/office/2019/extlst" xmlns:r="http://schemas.openxmlformats.org/officeDocument/2006/relationships" xmlns:wp14="http://schemas.microsoft.com/office/word/2010/wordprocessingDrawing" xmlns:wp="http://schemas.openxmlformats.org/drawingml/2006/wordprocessingDrawing" xmlns:wpg="http://schemas.microsoft.com/office/word/2010/wordprocessingGroup" xmlns:wpi="http://schemas.microsoft.com/office/word/2010/wordprocessingInk" xmlns:wps="http://schemas.microsoft.com/office/word/2010/wordprocessingShape" xmlns:o="urn:schemas-microsoft-com:office:office" xmlns:v="urn:schemas-microsoft-com:vml" xmlns:w10="urn:schemas-microsoft-com:office:word" xmlns:w="http://schemas.openxmlformats.org/wordprocessingml/2006/main" xmlns:w14="http://schemas.microsoft.com/office/word/2010/wordml" xmlns:w15="http://schemas.microsoft.com/office/word/2012/wordml" xmlns:w16cex="http://schemas.microsoft.com/office/word/2018/wordml/cex" xmlns:w16cid="http://schemas.microsoft.com/office/word/2016/wordml/cid" xmlns:w16="http://schemas.microsoft.com/office/word/2018/wordml" xmlns:w16sdtdh="http://schemas.microsoft.com/office/word/2020/wordml/sdtdatahash" xmlns:w16sdtfl="http://schemas.microsoft.com/office/word/2024/wordml/sdtformatlock" xmlns:w16se="http://schemas.microsoft.com/office/word/2015/wordml/symex" xmlns:w16du="http://schemas.microsoft.com/office/word/2023/wordml/word16du" xmlns:wne="http://schemas.microsoft.com/office/word/2006/wordml" mc:Ignorable="w14 w15 w16se w16cid w16 w16cex w16sdtdh w16sdtfl w16du wp14">
-  <w:sdt>
-    <w:sdtPr>
-      <w:rPr>
-        <w:rStyle w:val="PageNumber"/>
+  <w:tbl>
+    <w:tblPr>
+      <w:tblStyle w:val="TableGrid"/>
+      <w:tblW w:w="0" w:type="auto"/>
+      <w:tblBorders>
+        <w:top w:val="none" w:sz="0" w:space="0" w:color="auto"/>
+        <w:left w:val="none" w:sz="0" w:space="0" w:color="auto"/>
+        <w:bottom w:val="none" w:sz="0" w:space="0" w:color="auto"/>
+        <w:right w:val="none" w:sz="0" w:space="0" w:color="auto"/>
+        <w:insideH w:val="none" w:sz="0" w:space="0" w:color="auto"/>
+        <w:insideV w:val="none" w:sz="0" w:space="0" w:color="auto"/>
+      </w:tblBorders>
+      <w:tblLook w:val="04A0" w:firstRow="1" w:lastRow="0" w:firstColumn="1" w:lastColumn="0" w:noHBand="0" w:noVBand="1"/>
+    </w:tblPr>
+    <w:tblGrid>
+      <w:gridCol w:w="3005"/>
+      <w:gridCol w:w="3005"/>
+      <w:gridCol w:w="3006"/>
+    </w:tblGrid>
+    <w:tr>
+      <w:tc>
+        <w:tcPr>
+          <w:tcW w:w="3005" w:type="dxa"/>
+        </w:tcPr>
+        <w:p>
+          <w:pPr>
+            <w:pStyle w:val="Footer"/>
+            <w:rPr>
+              <w:sz w:val="20"/>
+              <w:szCs w:val="20"/>
+            </w:rPr>
+          </w:pPr>
+          <w:r>
+            <w:rPr>
+              <w:sz w:val="20"/>
+              <w:szCs w:val="20"/>
+            </w:rPr>
+            <w:fldChar w:fldCharType="begin"/>
+          </w:r>
+          <w:r>
+            <w:rPr>
+              <w:sz w:val="20"/>
+              <w:szCs w:val="20"/>
+            </w:rPr>
+            <w:instrText xml:space="preserve"> DOCPROPERTY doc_title \* MERGEFORMAT </w:instrText>
+          </w:r>
+          <w:r>
+            <w:rPr>
+              <w:sz w:val="20"/>
+              <w:szCs w:val="20"/>
+            </w:rPr>
+            <w:fldChar w:fldCharType="separate"/>
+          </w:r>
+          <w:r>
+            <w:rPr>
+              <w:sz w:val="20"/>
+              <w:szCs w:val="20"/>
+            </w:rPr>
+            <w:t>Document Title</w:t>
+          </w:r>
+          <w:r>
+            <w:rPr>
+              <w:sz w:val="20"/>
+              <w:szCs w:val="20"/>
+            </w:rPr>
+            <w:fldChar w:fldCharType="end"/>
+          </w:r>
+        </w:p>
+        <w:p>
+          <w:pPr>
+            <w:pStyle w:val="Footer"/>
+            <w:rPr>
+              <w:sz w:val="20"/>
+              <w:szCs w:val="20"/>
+            </w:rPr>
+          </w:pPr>
+          <w:r>
+            <w:rPr>
+              <w:sz w:val="20"/>
+              <w:szCs w:val="20"/>
+            </w:rPr>
+            <w:fldChar w:fldCharType="begin"/>
+          </w:r>
+          <w:r>
+            <w:rPr>
+              <w:sz w:val="20"/>
+              <w:szCs w:val="20"/>
+            </w:rPr>
+            <w:instrText xml:space="preserve"> DOCPROPERTY doc_sub_title \* MERGEFORMAT </w:instrText>
+          </w:r>
+          <w:r>
+            <w:rPr>
+              <w:sz w:val="20"/>
+              <w:szCs w:val="20"/>
+            </w:rPr>
+            <w:fldChar w:fldCharType="separate"/>
+          </w:r>
+          <w:r>
+            <w:rPr>
+              <w:sz w:val="20"/>
+              <w:szCs w:val="20"/>
+            </w:rPr>
+            <w:t>Document Sub Title</w:t>
+          </w:r>
+          <w:r>
+            <w:rPr>
+              <w:sz w:val="20"/>
+              <w:szCs w:val="20"/>
+            </w:rPr>
+            <w:fldChar w:fldCharType="end"/>
+          </w:r>
+        </w:p>
+      </w:tc>
+      <w:tc>
+        <w:tcPr>
+          <w:tcW w:w="3005" w:type="dxa"/>
+        </w:tcPr>
+        <w:p>
+          <w:pPr>
+            <w:pStyle w:val="Footer"/>
+            <w:jc w:val="center"/>
+            <w:rPr>
+              <w:sz w:val="20"/>
+              <w:szCs w:val="20"/>
+            </w:rPr>
+          </w:pPr>
+          <w:r>
+            <w:rPr>
+              <w:b/>
+              <w:bCs/>
+              <w:color w:val="EE0000"/>
+              <w:sz w:val="20"/>
+              <w:szCs w:val="20"/>
+            </w:rPr>
+            <w:fldChar w:fldCharType="begin"/>
+          </w:r>
+          <w:r>
+            <w:rPr>
+              <w:b/>
+              <w:bCs/>
+              <w:color w:val="EE0000"/>
+              <w:sz w:val="20"/>
+              <w:szCs w:val="20"/>
+            </w:rPr>
+            <w:instrText xml:space="preserve"> DOCPROPERTY classification \* MERGEFORMAT </w:instrText>
+          </w:r>
+          <w:r>
+            <w:rPr>
+              <w:b/>
+              <w:bCs/>
+              <w:color w:val="EE0000"/>
+              <w:sz w:val="20"/>
+              <w:szCs w:val="20"/>
+            </w:rPr>
+            <w:fldChar w:fldCharType="separate"/>
+          </w:r>
+          <w:r>
+            <w:rPr>
+              <w:b/>
+              <w:bCs/>
+              <w:color w:val="EE0000"/>
+              <w:sz w:val="20"/>
+              <w:szCs w:val="20"/>
+            </w:rPr>
+            <w:t>CLASSIFICATION</w:t>
+          </w:r>
+          <w:r>
+            <w:rPr>
+              <w:b/>
+              <w:bCs/>
+              <w:color w:val="EE0000"/>
+              <w:sz w:val="20"/>
+              <w:szCs w:val="20"/>
+            </w:rPr>
+            <w:fldChar w:fldCharType="end"/>
+          </w:r>
+        </w:p>
+      </w:tc>
+      <w:tc>
+        <w:tcPr>
+          <w:tcW w:w="3006" w:type="dxa"/>
+        </w:tcPr>
+        <w:sdt>
+          <w:sdtPr>
+            <w:rPr>
+              <w:rStyle w:val="PageNumber"/>
+              <w:sz w:val="20"/>
+              <w:szCs w:val="20"/>
+            </w:rPr>
+            <w:id w:val="1657418890"/>
+            <w:docPartObj>
+              <w:docPartGallery w:val="Page Numbers (Bottom of Page)"/>
+              <w:docPartUnique/>
+            </w:docPartObj>
+          </w:sdtPr>
+          <w:sdtContent>
+            <w:p>
+              <w:pPr>
+                <w:pStyle w:val="Footer"/>
+                <w:jc w:val="right"/>
+                <w:rPr>
+                  <w:sz w:val="20"/>
+                  <w:szCs w:val="20"/>
+                </w:rPr>
+              </w:pPr>
+              <w:r>
+                <w:rPr>
+                  <w:rStyle w:val="PageNumber"/>
+                  <w:sz w:val="20"/>
+                  <w:szCs w:val="20"/>
+                </w:rPr>
+                <w:t xml:space="preserve">Page </w:t>
+              </w:r>
+              <w:r>
+                <w:rPr>
+                  <w:rStyle w:val="PageNumber"/>
+                  <w:sz w:val="20"/>
+                  <w:szCs w:val="20"/>
+                </w:rPr>
+                <w:fldChar w:fldCharType="begin"/>
+              </w:r>
+              <w:r>
+                <w:rPr>
+                  <w:rStyle w:val="PageNumber"/>
+                  <w:sz w:val="20"/>
+                  <w:szCs w:val="20"/>
+                </w:rPr>
+                <w:instrText xml:space="preserve"> PAGE </w:instrText>
+              </w:r>
+              <w:r>
+                <w:rPr>
+                  <w:rStyle w:val="PageNumber"/>
+                  <w:sz w:val="20"/>
+                  <w:szCs w:val="20"/>
+                </w:rPr>
+                <w:fldChar w:fldCharType="separate"/>
+              </w:r>
+              <w:r>
+                <w:rPr>
+                  <w:rStyle w:val="PageNumber"/>
+                  <w:sz w:val="20"/>
+                  <w:szCs w:val="20"/>
+                </w:rPr>
+                <w:t>1</w:t>
+              </w:r>
+              <w:r>
+                <w:rPr>
+                  <w:rStyle w:val="PageNumber"/>
+                  <w:sz w:val="20"/>
+                  <w:szCs w:val="20"/>
+                </w:rPr>
+                <w:fldChar w:fldCharType="end"/>
+              </w:r>
+              <w:r>
+                <w:rPr>
+                  <w:rStyle w:val="PageNumber"/>
+                  <w:sz w:val="20"/>
+                  <w:szCs w:val="20"/>
+                </w:rPr>
+                <w:t xml:space="preserve"> of </w:t>
+              </w:r>
+              <w:r>
+                <w:rPr>
+                  <w:rStyle w:val="PageNumber"/>
+                  <w:sz w:val="20"/>
+                  <w:szCs w:val="20"/>
+                </w:rPr>
+                <w:fldChar w:fldCharType="begin"/>
+              </w:r>
+              <w:r>
+                <w:rPr>
+                  <w:rStyle w:val="PageNumber"/>
+                  <w:sz w:val="20"/>
+                  <w:szCs w:val="20"/>
+                </w:rPr>
+                <w:instrText xml:space="preserve"> NUMPAGES  \* MERGEFORMAT </w:instrText>
+              </w:r>
+              <w:r>
+                <w:rPr>
+                  <w:rStyle w:val="PageNumber"/>
+                  <w:sz w:val="20"/>
+                  <w:szCs w:val="20"/>
+                </w:rPr>
+                <w:fldChar w:fldCharType="separate"/>
+              </w:r>
+              <w:r>
+                <w:rPr>
+                  <w:rStyle w:val="PageNumber"/>
+                  <w:sz w:val="20"/>
+                  <w:szCs w:val="20"/>
+                </w:rPr>
+                <w:t>3</w:t>
+              </w:r>
+              <w:r>
+                <w:rPr>
+                  <w:rStyle w:val="PageNumber"/>
+                  <w:sz w:val="20"/>
+                  <w:szCs w:val="20"/>
+                </w:rPr>
+                <w:fldChar w:fldCharType="end"/>
+              </w:r>
+            </w:p>
+          </w:sdtContent>
+        </w:sdt>
+      </w:tc>
+    </w:tr>
+  </w:tbl>
+  <w:p>
+    <w:pPr>
+      <w:pStyle w:val="Footer"/>
+      <w:rPr>
         <w:sz w:val="20"/>
         <w:szCs w:val="20"/>
       </w:rPr>
-      <w:id w:val="1657418890"/>
-      <w:docPartObj>
-        <w:docPartGallery w:val="Page Numbers (Bottom of Page)"/>
-        <w:docPartUnique/>
-      </w:docPartObj>
-    </w:sdtPr>
-    <w:sdtContent>
-      <w:p>
-        <w:pPr>
-          <w:pStyle w:val="Footer"/>
-          <w:framePr w:wrap="none" w:vAnchor="text" w:hAnchor="margin" w:xAlign="right" w:y="1"/>
-          <w:rPr>
-            <w:rStyle w:val="PageNumber"/>
-            <w:sz w:val="20"/>
-            <w:szCs w:val="20"/>
-          </w:rPr>
-        </w:pPr>
-        <w:r>
-          <w:rPr>
-            <w:rStyle w:val="PageNumber"/>
-            <w:sz w:val="20"/>
-            <w:szCs w:val="20"/>
-          </w:rPr>
-          <w:t xml:space="preserve">Page </w:t>
-        </w:r>
-        <w:r>
-          <w:rPr>
-            <w:rStyle w:val="PageNumber"/>
-            <w:sz w:val="20"/>
-            <w:szCs w:val="20"/>
-          </w:rPr>
-          <w:fldChar w:fldCharType="begin"/>
-        </w:r>
-        <w:r>
-          <w:rPr>
-            <w:rStyle w:val="PageNumber"/>
-            <w:sz w:val="20"/>
-            <w:szCs w:val="20"/>
-          </w:rPr>
-          <w:instrText xml:space="preserve"> PAGE </w:instrText>
-        </w:r>
-        <w:r>
-          <w:rPr>
-            <w:rStyle w:val="PageNumber"/>
-            <w:sz w:val="20"/>
-            <w:szCs w:val="20"/>
-          </w:rPr>
-          <w:fldChar w:fldCharType="separate"/>
-        </w:r>
-        <w:r>
-          <w:rPr>
-            <w:rStyle w:val="PageNumber"/>
-            <w:sz w:val="20"/>
-            <w:szCs w:val="20"/>
-          </w:rPr>
-          <w:t>2</w:t>
-        </w:r>
-        <w:r>
-          <w:rPr>
-            <w:rStyle w:val="PageNumber"/>
-            <w:sz w:val="20"/>
-            <w:szCs w:val="20"/>
-          </w:rPr>
-          <w:fldChar w:fldCharType="end"/>
-        </w:r>
-        <w:r>
-          <w:rPr>
-            <w:rStyle w:val="PageNumber"/>
-            <w:sz w:val="20"/>
-            <w:szCs w:val="20"/>
-          </w:rPr>
-          <w:t xml:space="preserve"> of </w:t>
-        </w:r>
-        <w:r>
-          <w:rPr>
-            <w:rStyle w:val="PageNumber"/>
-            <w:sz w:val="20"/>
-            <w:szCs w:val="20"/>
-          </w:rPr>
-          <w:fldChar w:fldCharType="begin"/>
-        </w:r>
-        <w:r>
-          <w:rPr>
-            <w:rStyle w:val="PageNumber"/>
-            <w:sz w:val="20"/>
-            <w:szCs w:val="20"/>
-          </w:rPr>
-          <w:instrText xml:space="preserve"> NUMPAGES  \* MERGEFORMAT </w:instrText>
-        </w:r>
-        <w:r>
-          <w:rPr>
-            <w:rStyle w:val="PageNumber"/>
-            <w:sz w:val="20"/>
-            <w:szCs w:val="20"/>
-          </w:rPr>
-          <w:fldChar w:fldCharType="separate"/>
-        </w:r>
-        <w:r>
-          <w:rPr>
-            <w:rStyle w:val="PageNumber"/>
-            <w:sz w:val="20"/>
-            <w:szCs w:val="20"/>
-          </w:rPr>
-          <w:t>3</w:t>
-        </w:r>
-        <w:r>
-          <w:rPr>
-            <w:rStyle w:val="PageNumber"/>
-            <w:sz w:val="20"/>
-            <w:szCs w:val="20"/>
-          </w:rPr>
-          <w:fldChar w:fldCharType="end"/>
-        </w:r>
-      </w:p>
-    </w:sdtContent>
-  </w:sdt>
-  <w:p>
-    <w:pPr>
-      <w:pStyle w:val="Footer"/>
-      <w:ind w:right="360"/>
-      <w:rPr>
-        <w:sz w:val="20"/>
-        <w:szCs w:val="20"/>
-      </w:rPr>
-    </w:pPr>
-    <w:r>
-      <w:rPr>
-        <w:sz w:val="20"/>
-        <w:szCs w:val="20"/>
-      </w:rPr>
-      <w:fldChar w:fldCharType="begin"/>
-    </w:r>
-    <w:r>
-      <w:rPr>
-        <w:sz w:val="20"/>
-        <w:szCs w:val="20"/>
-      </w:rPr>
-      <w:instrText xml:space="preserve"> DOCPROPERTY doc_title \* MERGEFORMAT </w:instrText>
-    </w:r>
-    <w:r>
-      <w:rPr>
-        <w:sz w:val="20"/>
-        <w:szCs w:val="20"/>
-      </w:rPr>
-      <w:fldChar w:fldCharType="separate"/>
-    </w:r>
-    <w:r>
-      <w:rPr>
-        <w:sz w:val="20"/>
-        <w:szCs w:val="20"/>
-      </w:rPr>
-      <w:t>Document Title</w:t>
-    </w:r>
-    <w:r>
-      <w:rPr>
-        <w:sz w:val="20"/>
-        <w:szCs w:val="20"/>
-      </w:rPr>
-      <w:fldChar w:fldCharType="end"/>
-    </w:r>
-    <w:r>
-      <w:rPr>
-        <w:sz w:val="20"/>
-        <w:szCs w:val="20"/>
-      </w:rPr>
-      <w:tab/>
-      <w:t xml:space="preserve"> </w:t>
-    </w:r>
-    <w:r>
-      <w:rPr>
-        <w:b/>
-        <w:bCs/>
-        <w:color w:val="EE0000"/>
-        <w:sz w:val="20"/>
-        <w:szCs w:val="20"/>
-      </w:rPr>
-      <w:fldChar w:fldCharType="begin"/>
-    </w:r>
-    <w:r>
-      <w:rPr>
-        <w:b/>
-        <w:bCs/>
-        <w:color w:val="EE0000"/>
-        <w:sz w:val="20"/>
-        <w:szCs w:val="20"/>
-      </w:rPr>
-      <w:instrText xml:space="preserve"> DOCPROPERTY classification \* MERGEFORMAT </w:instrText>
-    </w:r>
-    <w:r>
-      <w:rPr>
-        <w:b/>
-        <w:bCs/>
-        <w:color w:val="EE0000"/>
-        <w:sz w:val="20"/>
-        <w:szCs w:val="20"/>
-      </w:rPr>
-      <w:fldChar w:fldCharType="separate"/>
-    </w:r>
-    <w:r>
-      <w:rPr>
-        <w:b/>
-        <w:bCs/>
-        <w:color w:val="EE0000"/>
-        <w:sz w:val="20"/>
-        <w:szCs w:val="20"/>
-      </w:rPr>
-      <w:t>CLASSIFICATION</w:t>
-    </w:r>
-    <w:r>
-      <w:rPr>
-        <w:b/>
-        <w:bCs/>
-        <w:color w:val="EE0000"/>
-        <w:sz w:val="20"/>
-        <w:szCs w:val="20"/>
-      </w:rPr>
-      <w:fldChar w:fldCharType="end"/>
-    </w:r>
-  </w:p>
-  <w:p>
-    <w:pPr>
-      <w:pStyle w:val="Footer"/>
-      <w:rPr>
-        <w:sz w:val="20"/>
-        <w:szCs w:val="20"/>
-      </w:rPr>
-    </w:pPr>
-    <w:r>
-      <w:rPr>
-        <w:sz w:val="20"/>
-        <w:szCs w:val="20"/>
-      </w:rPr>
-      <w:fldChar w:fldCharType="begin"/>
-    </w:r>
-    <w:r>
-      <w:rPr>
-        <w:sz w:val="20"/>
-        <w:szCs w:val="20"/>
-      </w:rPr>
-      <w:instrText xml:space="preserve"> DOCPROPERTY doc_sub_title \* MERGEFORMAT </w:instrText>
-    </w:r>
-    <w:r>
-      <w:rPr>
-        <w:sz w:val="20"/>
-        <w:szCs w:val="20"/>
-      </w:rPr>
-      <w:fldChar w:fldCharType="separate"/>
-    </w:r>
-    <w:r>
-      <w:rPr>
-        <w:sz w:val="20"/>
-        <w:szCs w:val="20"/>
-      </w:rPr>
-      <w:t>Document Sub Title</w:t>
-    </w:r>
-    <w:r>
-      <w:rPr>
-        <w:sz w:val="20"/>
-        <w:szCs w:val="20"/>
-      </w:rPr>
-      <w:fldChar w:fldCharType="end"/>
-    </w:r>
+    </w:pPr>
   </w:p>
 </w:ftr>
 </file>
@@ -888,10 +1101,118 @@
 
 <file path=word/header2.xml><?xml version="1.0" encoding="utf-8"?>
 <w:hdr xmlns:wpc="http://schemas.microsoft.com/office/word/2010/wordprocessingCanvas" xmlns:cx="http://schemas.microsoft.com/office/drawing/2014/chartex" xmlns:cx1="http://schemas.microsoft.com/office/drawing/2015/9/8/chartex" xmlns:cx2="http://schemas.microsoft.com/office/drawing/2015/10/21/chartex" xmlns:cx3="http://schemas.microsoft.com/office/drawing/2016/5/9/chartex" xmlns:cx4="http://schemas.microsoft.com/office/drawing/2016/5/10/chartex" xmlns:cx5="http://schemas.microsoft.com/office/drawing/2016/5/11/chartex" xmlns:cx6="http://schemas.microsoft.com/office/drawing/2016/5/12/chartex" xmlns:cx7="http://schemas.microsoft.com/office/drawing/2016/5/13/chartex" xmlns:cx8="http://schemas.microsoft.com/office/drawing/2016/5/14/chartex" xmlns:mc="http://schemas.openxmlformats.org/markup-compatibility/2006" xmlns:m="http://schemas.openxmlformats.org/officeDocument/2006/math" xmlns:aink="http://schemas.microsoft.com/office/drawing/2016/ink" xmlns:am3d="http://schemas.microsoft.com/office/drawing/2017/model3d" xmlns:oel="http://schemas.microsoft.com/office/2019/extlst" xmlns:r="http://schemas.openxmlformats.org/officeDocument/2006/relationships" xmlns:wp14="http://schemas.microsoft.com/office/word/2010/wordprocessingDrawing" xmlns:wp="http://schemas.openxmlformats.org/drawingml/2006/wordprocessingDrawing" xmlns:wpg="http://schemas.microsoft.com/office/word/2010/wordprocessingGroup" xmlns:wpi="http://schemas.microsoft.com/office/word/2010/wordprocessingInk" xmlns:wps="http://schemas.microsoft.com/office/word/2010/wordprocessingShape" xmlns:o="urn:schemas-microsoft-com:office:office" xmlns:v="urn:schemas-microsoft-com:vml" xmlns:w10="urn:schemas-microsoft-com:office:word" xmlns:w="http://schemas.openxmlformats.org/wordprocessingml/2006/main" xmlns:w14="http://schemas.microsoft.com/office/word/2010/wordml" xmlns:w15="http://schemas.microsoft.com/office/word/2012/wordml" xmlns:w16cex="http://schemas.microsoft.com/office/word/2018/wordml/cex" xmlns:w16cid="http://schemas.microsoft.com/office/word/2016/wordml/cid" xmlns:w16="http://schemas.microsoft.com/office/word/2018/wordml" xmlns:w16sdtdh="http://schemas.microsoft.com/office/word/2020/wordml/sdtdatahash" xmlns:w16sdtfl="http://schemas.microsoft.com/office/word/2024/wordml/sdtformatlock" xmlns:w16se="http://schemas.microsoft.com/office/word/2015/wordml/symex" xmlns:w16du="http://schemas.microsoft.com/office/word/2023/wordml/word16du" xmlns:wne="http://schemas.microsoft.com/office/word/2006/wordml" mc:Ignorable="w14 w15 w16se w16cid w16 w16cex w16sdtdh w16sdtfl w16du wp14">
+  <w:tbl>
+    <w:tblPr>
+      <w:tblStyle w:val="TableGrid"/>
+      <w:tblW w:w="0" w:type="auto"/>
+      <w:tblBorders>
+        <w:top w:val="none" w:sz="0" w:space="0" w:color="auto"/>
+        <w:left w:val="none" w:sz="0" w:space="0" w:color="auto"/>
+        <w:bottom w:val="none" w:sz="0" w:space="0" w:color="auto"/>
+        <w:right w:val="none" w:sz="0" w:space="0" w:color="auto"/>
+        <w:insideH w:val="none" w:sz="0" w:space="0" w:color="auto"/>
+        <w:insideV w:val="none" w:sz="0" w:space="0" w:color="auto"/>
+      </w:tblBorders>
+      <w:tblLook w:val="04A0" w:firstRow="1" w:lastRow="0" w:firstColumn="1" w:lastColumn="0" w:noHBand="0" w:noVBand="1"/>
+    </w:tblPr>
+    <w:tblGrid>
+      <w:gridCol w:w="3005"/>
+      <w:gridCol w:w="3005"/>
+      <w:gridCol w:w="3006"/>
+    </w:tblGrid>
+    <w:tr>
+      <w:tc>
+        <w:tcPr>
+          <w:tcW w:w="3005" w:type="dxa"/>
+        </w:tcPr>
+        <w:p>
+          <w:pPr>
+            <w:pStyle w:val="Header"/>
+          </w:pPr>
+          <w:fldSimple w:instr=" DOCPROPERTY &quot;doc_id&quot; \* MERGEFORMAT ">
+            <w:r>
+              <w:t>Doc ID</w:t>
+            </w:r>
+          </w:fldSimple>
+        </w:p>
+      </w:tc>
+      <w:tc>
+        <w:tcPr>
+          <w:tcW w:w="3005" w:type="dxa"/>
+        </w:tcPr>
+        <w:p>
+          <w:pPr>
+            <w:pStyle w:val="Header"/>
+            <w:jc w:val="center"/>
+          </w:pPr>
+          <w:r>
+            <w:rPr>
+              <w:b/>
+              <w:bCs/>
+              <w:color w:val="EE0000"/>
+              <w:sz w:val="21"/>
+              <w:szCs w:val="21"/>
+            </w:rPr>
+            <w:fldChar w:fldCharType="begin"/>
+          </w:r>
+          <w:r>
+            <w:rPr>
+              <w:b/>
+              <w:bCs/>
+              <w:color w:val="EE0000"/>
+              <w:sz w:val="21"/>
+              <w:szCs w:val="21"/>
+            </w:rPr>
+            <w:instrText xml:space="preserve"> DOCPROPERTY "CLASSIFICATION" \* MERGEFORMAT </w:instrText>
+          </w:r>
+          <w:r>
+            <w:rPr>
+              <w:b/>
+              <w:bCs/>
+              <w:color w:val="EE0000"/>
+              <w:sz w:val="21"/>
+              <w:szCs w:val="21"/>
+            </w:rPr>
+            <w:fldChar w:fldCharType="separate"/>
+          </w:r>
+          <w:r>
+            <w:rPr>
+              <w:b/>
+              <w:bCs/>
+              <w:color w:val="EE0000"/>
+              <w:sz w:val="21"/>
+              <w:szCs w:val="21"/>
+            </w:rPr>
+            <w:t>CLASSIFICATION</w:t>
+          </w:r>
+          <w:r>
+            <w:rPr>
+              <w:b/>
+              <w:bCs/>
+              <w:color w:val="EE0000"/>
+              <w:sz w:val="21"/>
+              <w:szCs w:val="21"/>
+            </w:rPr>
+            <w:fldChar w:fldCharType="end"/>
+          </w:r>
+        </w:p>
+      </w:tc>
+      <w:tc>
+        <w:tcPr>
+          <w:tcW w:w="3006" w:type="dxa"/>
+        </w:tcPr>
+        <w:p>
+          <w:pPr>
+            <w:pStyle w:val="Header"/>
+            <w:jc w:val="right"/>
+          </w:pPr>
+        </w:p>
+      </w:tc>
+    </w:tr>
+  </w:tbl>
   <w:p>
     <w:pPr>
       <w:pStyle w:val="Header"/>
-      <w:jc w:val="center"/>
     </w:pPr>
   </w:p>
 </w:hdr>
@@ -899,68 +1220,119 @@
 
 <file path=word/header3.xml><?xml version="1.0" encoding="utf-8"?>
 <w:hdr xmlns:wpc="http://schemas.microsoft.com/office/word/2010/wordprocessingCanvas" xmlns:cx="http://schemas.microsoft.com/office/drawing/2014/chartex" xmlns:cx1="http://schemas.microsoft.com/office/drawing/2015/9/8/chartex" xmlns:cx2="http://schemas.microsoft.com/office/drawing/2015/10/21/chartex" xmlns:cx3="http://schemas.microsoft.com/office/drawing/2016/5/9/chartex" xmlns:cx4="http://schemas.microsoft.com/office/drawing/2016/5/10/chartex" xmlns:cx5="http://schemas.microsoft.com/office/drawing/2016/5/11/chartex" xmlns:cx6="http://schemas.microsoft.com/office/drawing/2016/5/12/chartex" xmlns:cx7="http://schemas.microsoft.com/office/drawing/2016/5/13/chartex" xmlns:cx8="http://schemas.microsoft.com/office/drawing/2016/5/14/chartex" xmlns:mc="http://schemas.openxmlformats.org/markup-compatibility/2006" xmlns:m="http://schemas.openxmlformats.org/officeDocument/2006/math" xmlns:aink="http://schemas.microsoft.com/office/drawing/2016/ink" xmlns:am3d="http://schemas.microsoft.com/office/drawing/2017/model3d" xmlns:oel="http://schemas.microsoft.com/office/2019/extlst" xmlns:r="http://schemas.openxmlformats.org/officeDocument/2006/relationships" xmlns:wp14="http://schemas.microsoft.com/office/word/2010/wordprocessingDrawing" xmlns:wp="http://schemas.openxmlformats.org/drawingml/2006/wordprocessingDrawing" xmlns:wpg="http://schemas.microsoft.com/office/word/2010/wordprocessingGroup" xmlns:wpi="http://schemas.microsoft.com/office/word/2010/wordprocessingInk" xmlns:wps="http://schemas.microsoft.com/office/word/2010/wordprocessingShape" xmlns:o="urn:schemas-microsoft-com:office:office" xmlns:v="urn:schemas-microsoft-com:vml" xmlns:w10="urn:schemas-microsoft-com:office:word" xmlns:w="http://schemas.openxmlformats.org/wordprocessingml/2006/main" xmlns:w14="http://schemas.microsoft.com/office/word/2010/wordml" xmlns:w15="http://schemas.microsoft.com/office/word/2012/wordml" xmlns:w16cex="http://schemas.microsoft.com/office/word/2018/wordml/cex" xmlns:w16cid="http://schemas.microsoft.com/office/word/2016/wordml/cid" xmlns:w16="http://schemas.microsoft.com/office/word/2018/wordml" xmlns:w16sdtdh="http://schemas.microsoft.com/office/word/2020/wordml/sdtdatahash" xmlns:w16sdtfl="http://schemas.microsoft.com/office/word/2024/wordml/sdtformatlock" xmlns:w16se="http://schemas.microsoft.com/office/word/2015/wordml/symex" xmlns:w16du="http://schemas.microsoft.com/office/word/2023/wordml/word16du" xmlns:wne="http://schemas.microsoft.com/office/word/2006/wordml" mc:Ignorable="w14 w15 w16se w16cid w16 w16cex w16sdtdh w16sdtfl w16du wp14">
+  <w:tbl>
+    <w:tblPr>
+      <w:tblStyle w:val="TableGrid"/>
+      <w:tblW w:w="0" w:type="auto"/>
+      <w:tblBorders>
+        <w:top w:val="none" w:sz="0" w:space="0" w:color="auto"/>
+        <w:left w:val="none" w:sz="0" w:space="0" w:color="auto"/>
+        <w:bottom w:val="none" w:sz="0" w:space="0" w:color="auto"/>
+        <w:right w:val="none" w:sz="0" w:space="0" w:color="auto"/>
+        <w:insideH w:val="none" w:sz="0" w:space="0" w:color="auto"/>
+        <w:insideV w:val="none" w:sz="0" w:space="0" w:color="auto"/>
+      </w:tblBorders>
+      <w:tblLook w:val="04A0" w:firstRow="1" w:lastRow="0" w:firstColumn="1" w:lastColumn="0" w:noHBand="0" w:noVBand="1"/>
+    </w:tblPr>
+    <w:tblGrid>
+      <w:gridCol w:w="3005"/>
+      <w:gridCol w:w="3005"/>
+      <w:gridCol w:w="3006"/>
+    </w:tblGrid>
+    <w:tr>
+      <w:tc>
+        <w:tcPr>
+          <w:tcW w:w="3005" w:type="dxa"/>
+        </w:tcPr>
+        <w:p>
+          <w:pPr>
+            <w:pStyle w:val="Header"/>
+          </w:pPr>
+          <w:fldSimple w:instr=" DOCPROPERTY &quot;doc_id&quot; \* MERGEFORMAT ">
+            <w:r>
+              <w:t>Doc ID</w:t>
+            </w:r>
+          </w:fldSimple>
+        </w:p>
+      </w:tc>
+      <w:tc>
+        <w:tcPr>
+          <w:tcW w:w="3005" w:type="dxa"/>
+        </w:tcPr>
+        <w:p>
+          <w:pPr>
+            <w:pStyle w:val="Header"/>
+            <w:jc w:val="center"/>
+          </w:pPr>
+          <w:r>
+            <w:rPr>
+              <w:b/>
+              <w:bCs/>
+              <w:color w:val="EE0000"/>
+              <w:sz w:val="21"/>
+              <w:szCs w:val="21"/>
+            </w:rPr>
+            <w:fldChar w:fldCharType="begin"/>
+          </w:r>
+          <w:r>
+            <w:rPr>
+              <w:b/>
+              <w:bCs/>
+              <w:color w:val="EE0000"/>
+              <w:sz w:val="21"/>
+              <w:szCs w:val="21"/>
+            </w:rPr>
+            <w:instrText xml:space="preserve"> DOCPROPERTY "CLASSIFICATION" \* MERGEFORMAT </w:instrText>
+          </w:r>
+          <w:r>
+            <w:rPr>
+              <w:b/>
+              <w:bCs/>
+              <w:color w:val="EE0000"/>
+              <w:sz w:val="21"/>
+              <w:szCs w:val="21"/>
+            </w:rPr>
+            <w:fldChar w:fldCharType="separate"/>
+          </w:r>
+          <w:r>
+            <w:rPr>
+              <w:b/>
+              <w:bCs/>
+              <w:color w:val="EE0000"/>
+              <w:sz w:val="21"/>
+              <w:szCs w:val="21"/>
+            </w:rPr>
+            <w:t>CLASSIFICATION</w:t>
+          </w:r>
+          <w:r>
+            <w:rPr>
+              <w:b/>
+              <w:bCs/>
+              <w:color w:val="EE0000"/>
+              <w:sz w:val="21"/>
+              <w:szCs w:val="21"/>
+            </w:rPr>
+            <w:fldChar w:fldCharType="end"/>
+          </w:r>
+        </w:p>
+      </w:tc>
+      <w:tc>
+        <w:tcPr>
+          <w:tcW w:w="3006" w:type="dxa"/>
+        </w:tcPr>
+        <w:p>
+          <w:pPr>
+            <w:pStyle w:val="Header"/>
+            <w:jc w:val="right"/>
+          </w:pPr>
+        </w:p>
+      </w:tc>
+    </w:tr>
+  </w:tbl>
   <w:p>
     <w:pPr>
       <w:pStyle w:val="Header"/>
     </w:pPr>
-    <w:fldSimple w:instr=" DOCPROPERTY &quot;doc_id&quot; \* MERGEFORMAT ">
-      <w:r>
-        <w:t>Doc ID</w:t>
-      </w:r>
-    </w:fldSimple>
-    <w:r>
-      <w:tab/>
-    </w:r>
-    <w:r>
-      <w:rPr>
-        <w:b/>
-        <w:bCs/>
-        <w:color w:val="EE0000"/>
-        <w:sz w:val="21"/>
-        <w:szCs w:val="21"/>
-      </w:rPr>
-      <w:fldChar w:fldCharType="begin"/>
-    </w:r>
-    <w:r>
-      <w:rPr>
-        <w:b/>
-        <w:bCs/>
-        <w:color w:val="EE0000"/>
-        <w:sz w:val="21"/>
-        <w:szCs w:val="21"/>
-      </w:rPr>
-      <w:instrText xml:space="preserve"> DOCPROPERTY "CLASSIFICATION" \* MERGEFORMAT </w:instrText>
-    </w:r>
-    <w:r>
-      <w:rPr>
-        <w:b/>
-        <w:bCs/>
-        <w:color w:val="EE0000"/>
-        <w:sz w:val="21"/>
-        <w:szCs w:val="21"/>
-      </w:rPr>
-      <w:fldChar w:fldCharType="separate"/>
-    </w:r>
-    <w:r>
-      <w:rPr>
-        <w:b/>
-        <w:bCs/>
-        <w:color w:val="EE0000"/>
-        <w:sz w:val="21"/>
-        <w:szCs w:val="21"/>
-      </w:rPr>
-      <w:t>CLASSIFICATION</w:t>
-    </w:r>
-    <w:r>
-      <w:rPr>
-        <w:b/>
-        <w:bCs/>
-        <w:color w:val="EE0000"/>
-        <w:sz w:val="21"/>
-        <w:szCs w:val="21"/>
-      </w:rPr>
-      <w:fldChar w:fldCharType="end"/>
-    </w:r>
     <w:r>
       <w:tab/>
     </w:r>
@@ -1140,6 +1512,109 @@
     </w:pPr>
   </w:p>
 </w:hdr>
+</file>
+
+<file path=word/numbering.xml><?xml version="1.0" encoding="utf-8"?>
+<w:numbering xmlns:wpc="http://schemas.microsoft.com/office/word/2010/wordprocessingCanvas" xmlns:cx="http://schemas.microsoft.com/office/drawing/2014/chartex" xmlns:cx1="http://schemas.microsoft.com/office/drawing/2015/9/8/chartex" xmlns:cx2="http://schemas.microsoft.com/office/drawing/2015/10/21/chartex" xmlns:cx3="http://schemas.microsoft.com/office/drawing/2016/5/9/chartex" xmlns:cx4="http://schemas.microsoft.com/office/drawing/2016/5/10/chartex" xmlns:cx5="http://schemas.microsoft.com/office/drawing/2016/5/11/chartex" xmlns:cx6="http://schemas.microsoft.com/office/drawing/2016/5/12/chartex" xmlns:cx7="http://schemas.microsoft.com/office/drawing/2016/5/13/chartex" xmlns:cx8="http://schemas.microsoft.com/office/drawing/2016/5/14/chartex" xmlns:mc="http://schemas.openxmlformats.org/markup-compatibility/2006" xmlns:m="http://schemas.openxmlformats.org/officeDocument/2006/math" xmlns:aink="http://schemas.microsoft.com/office/drawing/2016/ink" xmlns:am3d="http://schemas.microsoft.com/office/drawing/2017/model3d" xmlns:oel="http://schemas.microsoft.com/office/2019/extlst" xmlns:r="http://schemas.openxmlformats.org/officeDocument/2006/relationships" xmlns:wp14="http://schemas.microsoft.com/office/word/2010/wordprocessingDrawing" xmlns:wp="http://schemas.openxmlformats.org/drawingml/2006/wordprocessingDrawing" xmlns:wpg="http://schemas.microsoft.com/office/word/2010/wordprocessingGroup" xmlns:wpi="http://schemas.microsoft.com/office/word/2010/wordprocessingInk" xmlns:wps="http://schemas.microsoft.com/office/word/2010/wordprocessingShape" xmlns:o="urn:schemas-microsoft-com:office:office" xmlns:v="urn:schemas-microsoft-com:vml" xmlns:w10="urn:schemas-microsoft-com:office:word" xmlns:w="http://schemas.openxmlformats.org/wordprocessingml/2006/main" xmlns:w14="http://schemas.microsoft.com/office/word/2010/wordml" xmlns:w15="http://schemas.microsoft.com/office/word/2012/wordml" xmlns:w16cex="http://schemas.microsoft.com/office/word/2018/wordml/cex" xmlns:w16cid="http://schemas.microsoft.com/office/word/2016/wordml/cid" xmlns:w16="http://schemas.microsoft.com/office/word/2018/wordml" xmlns:w16sdtdh="http://schemas.microsoft.com/office/word/2020/wordml/sdtdatahash" xmlns:w16sdtfl="http://schemas.microsoft.com/office/word/2024/wordml/sdtformatlock" xmlns:w16se="http://schemas.microsoft.com/office/word/2015/wordml/symex" xmlns:w16du="http://schemas.microsoft.com/office/word/2023/wordml/word16du" xmlns:wne="http://schemas.microsoft.com/office/word/2006/wordml" mc:Ignorable="w14 w15 w16se w16cid w16 w16cex w16sdtdh w16sdtfl w16du wp14">
+  <w:abstractNum w:abstractNumId="0" w15:restartNumberingAfterBreak="0">
+    <w:nsid w:val="0B8C1F64"/>
+    <w:multiLevelType w:val="multilevel"/>
+    <w:tmpl w:val="08090025"/>
+    <w:lvl w:ilvl="0">
+      <w:start w:val="1"/>
+      <w:numFmt w:val="decimal"/>
+      <w:pStyle w:val="Heading1"/>
+      <w:lvlText w:val="%1"/>
+      <w:lvlJc w:val="left"/>
+      <w:pPr>
+        <w:ind w:left="432" w:hanging="432"/>
+      </w:pPr>
+    </w:lvl>
+    <w:lvl w:ilvl="1">
+      <w:start w:val="1"/>
+      <w:numFmt w:val="decimal"/>
+      <w:pStyle w:val="Heading2"/>
+      <w:lvlText w:val="%1.%2"/>
+      <w:lvlJc w:val="left"/>
+      <w:pPr>
+        <w:ind w:left="576" w:hanging="576"/>
+      </w:pPr>
+    </w:lvl>
+    <w:lvl w:ilvl="2">
+      <w:start w:val="1"/>
+      <w:numFmt w:val="decimal"/>
+      <w:pStyle w:val="Heading3"/>
+      <w:lvlText w:val="%1.%2.%3"/>
+      <w:lvlJc w:val="left"/>
+      <w:pPr>
+        <w:ind w:left="720" w:hanging="720"/>
+      </w:pPr>
+    </w:lvl>
+    <w:lvl w:ilvl="3">
+      <w:start w:val="1"/>
+      <w:numFmt w:val="decimal"/>
+      <w:pStyle w:val="Heading4"/>
+      <w:lvlText w:val="%1.%2.%3.%4"/>
+      <w:lvlJc w:val="left"/>
+      <w:pPr>
+        <w:ind w:left="864" w:hanging="864"/>
+      </w:pPr>
+    </w:lvl>
+    <w:lvl w:ilvl="4">
+      <w:start w:val="1"/>
+      <w:numFmt w:val="decimal"/>
+      <w:pStyle w:val="Heading5"/>
+      <w:lvlText w:val="%1.%2.%3.%4.%5"/>
+      <w:lvlJc w:val="left"/>
+      <w:pPr>
+        <w:ind w:left="1008" w:hanging="1008"/>
+      </w:pPr>
+    </w:lvl>
+    <w:lvl w:ilvl="5">
+      <w:start w:val="1"/>
+      <w:numFmt w:val="decimal"/>
+      <w:pStyle w:val="Heading6"/>
+      <w:lvlText w:val="%1.%2.%3.%4.%5.%6"/>
+      <w:lvlJc w:val="left"/>
+      <w:pPr>
+        <w:ind w:left="1152" w:hanging="1152"/>
+      </w:pPr>
+    </w:lvl>
+    <w:lvl w:ilvl="6">
+      <w:start w:val="1"/>
+      <w:numFmt w:val="decimal"/>
+      <w:pStyle w:val="Heading7"/>
+      <w:lvlText w:val="%1.%2.%3.%4.%5.%6.%7"/>
+      <w:lvlJc w:val="left"/>
+      <w:pPr>
+        <w:ind w:left="1296" w:hanging="1296"/>
+      </w:pPr>
+    </w:lvl>
+    <w:lvl w:ilvl="7">
+      <w:start w:val="1"/>
+      <w:numFmt w:val="decimal"/>
+      <w:pStyle w:val="Heading8"/>
+      <w:lvlText w:val="%1.%2.%3.%4.%5.%6.%7.%8"/>
+      <w:lvlJc w:val="left"/>
+      <w:pPr>
+        <w:ind w:left="1440" w:hanging="1440"/>
+      </w:pPr>
+    </w:lvl>
+    <w:lvl w:ilvl="8">
+      <w:start w:val="1"/>
+      <w:numFmt w:val="decimal"/>
+      <w:pStyle w:val="Heading9"/>
+      <w:lvlText w:val="%1.%2.%3.%4.%5.%6.%7.%8.%9"/>
+      <w:lvlJc w:val="left"/>
+      <w:pPr>
+        <w:ind w:left="1584" w:hanging="1584"/>
+      </w:pPr>
+    </w:lvl>
+  </w:abstractNum>
+  <w:num w:numId="1" w16cid:durableId="1610430727">
+    <w:abstractNumId w:val="0"/>
+  </w:num>
+</w:numbering>
 </file>
 
 <file path=word/styles.xml><?xml version="1.0" encoding="utf-8"?>
@@ -1554,6 +2029,9 @@
     <w:pPr>
       <w:keepNext/>
       <w:keepLines/>
+      <w:numPr>
+        <w:numId w:val="1"/>
+      </w:numPr>
       <w:spacing w:before="360" w:after="80"/>
       <w:outlineLvl w:val="0"/>
     </w:pPr>
@@ -1577,6 +2055,10 @@
     <w:pPr>
       <w:keepNext/>
       <w:keepLines/>
+      <w:numPr>
+        <w:ilvl w:val="1"/>
+        <w:numId w:val="1"/>
+      </w:numPr>
       <w:spacing w:before="160" w:after="80"/>
       <w:outlineLvl w:val="1"/>
     </w:pPr>
@@ -1600,6 +2082,10 @@
     <w:pPr>
       <w:keepNext/>
       <w:keepLines/>
+      <w:numPr>
+        <w:ilvl w:val="2"/>
+        <w:numId w:val="1"/>
+      </w:numPr>
       <w:spacing w:before="160" w:after="80"/>
       <w:outlineLvl w:val="2"/>
     </w:pPr>
@@ -1623,6 +2109,10 @@
     <w:pPr>
       <w:keepNext/>
       <w:keepLines/>
+      <w:numPr>
+        <w:ilvl w:val="3"/>
+        <w:numId w:val="1"/>
+      </w:numPr>
       <w:spacing w:before="80" w:after="40"/>
       <w:outlineLvl w:val="3"/>
     </w:pPr>
@@ -1646,6 +2136,10 @@
     <w:pPr>
       <w:keepNext/>
       <w:keepLines/>
+      <w:numPr>
+        <w:ilvl w:val="4"/>
+        <w:numId w:val="1"/>
+      </w:numPr>
       <w:spacing w:before="80" w:after="40"/>
       <w:outlineLvl w:val="4"/>
     </w:pPr>
@@ -1667,6 +2161,10 @@
     <w:pPr>
       <w:keepNext/>
       <w:keepLines/>
+      <w:numPr>
+        <w:ilvl w:val="5"/>
+        <w:numId w:val="1"/>
+      </w:numPr>
       <w:spacing w:before="40" w:after="0"/>
       <w:outlineLvl w:val="5"/>
     </w:pPr>
@@ -1690,6 +2188,10 @@
     <w:pPr>
       <w:keepNext/>
       <w:keepLines/>
+      <w:numPr>
+        <w:ilvl w:val="6"/>
+        <w:numId w:val="1"/>
+      </w:numPr>
       <w:spacing w:before="40" w:after="0"/>
       <w:outlineLvl w:val="6"/>
     </w:pPr>
@@ -1711,6 +2213,10 @@
     <w:pPr>
       <w:keepNext/>
       <w:keepLines/>
+      <w:numPr>
+        <w:ilvl w:val="7"/>
+        <w:numId w:val="1"/>
+      </w:numPr>
       <w:spacing w:after="0"/>
       <w:outlineLvl w:val="7"/>
     </w:pPr>
@@ -1734,6 +2240,10 @@
     <w:pPr>
       <w:keepNext/>
       <w:keepLines/>
+      <w:numPr>
+        <w:ilvl w:val="8"/>
+        <w:numId w:val="1"/>
+      </w:numPr>
       <w:spacing w:after="0"/>
       <w:outlineLvl w:val="8"/>
     </w:pPr>
@@ -2153,19 +2663,19 @@
   </w:style>
   <w:style w:type="paragraph" w:styleId="TOCHeading">
     <w:name w:val="TOC Heading"/>
-    <w:basedOn w:val="Heading1"/>
     <w:next w:val="Normal"/>
     <w:uiPriority w:val="39"/>
     <w:unhideWhenUsed/>
     <w:qFormat/>
-    <w:rsid w:val="005A13C4"/>
+    <w:rsid w:val="00B35329"/>
     <w:pPr>
       <w:spacing w:before="480" w:after="0" w:line="276" w:lineRule="auto"/>
-      <w:outlineLvl w:val="9"/>
-    </w:pPr>
-    <w:rPr>
+    </w:pPr>
+    <w:rPr>
+      <w:rFonts w:asciiTheme="majorHAnsi" w:eastAsiaTheme="majorEastAsia" w:hAnsiTheme="majorHAnsi" w:cstheme="majorBidi"/>
       <w:b/>
       <w:bCs/>
+      <w:color w:val="2F5496" w:themeColor="accent1" w:themeShade="BF"/>
       <w:kern w:val="0"/>
       <w:sz w:val="28"/>
       <w:szCs w:val="28"/>
@@ -2382,6 +2892,81 @@
     <w:pPr>
       <w:spacing w:after="0"/>
     </w:pPr>
+  </w:style>
+  <w:style w:type="paragraph" w:customStyle="1" w:styleId="TableCaption">
+    <w:name w:val="Table Caption"/>
+    <w:basedOn w:val="Normal"/>
+    <w:qFormat/>
+    <w:rsid w:val="00CD32EF"/>
+    <w:pPr>
+      <w:jc w:val="center"/>
+    </w:pPr>
+    <w:rPr>
+      <w:bCs/>
+      <w:i/>
+      <w:noProof/>
+      <w:sz w:val="21"/>
+      <w:lang w:val="en-GB"/>
+    </w:rPr>
+  </w:style>
+  <w:style w:type="table" w:styleId="TableGrid">
+    <w:name w:val="Table Grid"/>
+    <w:basedOn w:val="TableNormal"/>
+    <w:uiPriority w:val="39"/>
+    <w:rsid w:val="001A2A5D"/>
+    <w:pPr>
+      <w:spacing w:after="0" w:line="240" w:lineRule="auto"/>
+    </w:pPr>
+    <w:tblPr>
+      <w:tblBorders>
+        <w:top w:val="single" w:sz="4" w:space="0" w:color="auto"/>
+        <w:left w:val="single" w:sz="4" w:space="0" w:color="auto"/>
+        <w:bottom w:val="single" w:sz="4" w:space="0" w:color="auto"/>
+        <w:right w:val="single" w:sz="4" w:space="0" w:color="auto"/>
+        <w:insideH w:val="single" w:sz="4" w:space="0" w:color="auto"/>
+        <w:insideV w:val="single" w:sz="4" w:space="0" w:color="auto"/>
+      </w:tblBorders>
+    </w:tblPr>
+  </w:style>
+  <w:style w:type="table" w:customStyle="1" w:styleId="table0">
+    <w:name w:val="table"/>
+    <w:basedOn w:val="TableNormal"/>
+    <w:uiPriority w:val="99"/>
+    <w:rsid w:val="003F51B5"/>
+    <w:pPr>
+      <w:spacing w:before="40" w:after="40" w:line="240" w:lineRule="auto"/>
+    </w:pPr>
+    <w:tblPr>
+      <w:tblBorders>
+        <w:top w:val="single" w:sz="4" w:space="0" w:color="000000" w:themeColor="text1"/>
+        <w:left w:val="single" w:sz="4" w:space="0" w:color="000000" w:themeColor="text1"/>
+        <w:bottom w:val="single" w:sz="4" w:space="0" w:color="000000" w:themeColor="text1"/>
+        <w:right w:val="single" w:sz="4" w:space="0" w:color="000000" w:themeColor="text1"/>
+        <w:insideH w:val="single" w:sz="4" w:space="0" w:color="000000" w:themeColor="text1"/>
+        <w:insideV w:val="single" w:sz="4" w:space="0" w:color="000000" w:themeColor="text1"/>
+      </w:tblBorders>
+    </w:tblPr>
+    <w:tcPr>
+      <w:vAlign w:val="center"/>
+    </w:tcPr>
+    <w:tblStylePr w:type="firstRow">
+      <w:rPr>
+        <w:b/>
+        <w:color w:val="FFFFFF" w:themeColor="background1"/>
+      </w:rPr>
+      <w:tblPr/>
+      <w:tcPr>
+        <w:tcBorders>
+          <w:top w:val="single" w:sz="4" w:space="0" w:color="000000" w:themeColor="text1"/>
+          <w:left w:val="single" w:sz="4" w:space="0" w:color="000000" w:themeColor="text1"/>
+          <w:bottom w:val="single" w:sz="4" w:space="0" w:color="000000" w:themeColor="text1"/>
+          <w:right w:val="single" w:sz="4" w:space="0" w:color="000000" w:themeColor="text1"/>
+          <w:insideH w:val="single" w:sz="4" w:space="0" w:color="000000" w:themeColor="text1"/>
+          <w:insideV w:val="single" w:sz="4" w:space="0" w:color="000000" w:themeColor="text1"/>
+        </w:tcBorders>
+        <w:shd w:val="clear" w:color="auto" w:fill="2E74B5" w:themeFill="accent5" w:themeFillShade="BF"/>
+      </w:tcPr>
+    </w:tblStylePr>
   </w:style>
 </w:styles>
 </file>

</xml_diff>